<commit_message>
(fix docx) add new info about oltp, etl and etc
</commit_message>
<xml_diff>
--- a/DB_CourseWork/Documentation.docx
+++ b/DB_CourseWork/Documentation.docx
@@ -226,127 +226,6 @@
     </w:p>
     <w:p>
       <w:pPr>
-        <w:spacing w:after="120"/>
-        <w:rPr>
-          <w:rFonts w:ascii="Arial" w:eastAsia="Arial" w:hAnsi="Arial" w:cs="Arial"/>
-          <w:sz w:val="22"/>
-          <w:szCs w:val="22"/>
-          <w:lang w:val="en-US"/>
-        </w:rPr>
-      </w:pPr>
-      <w:r>
-        <w:rPr>
-          <w:rFonts w:ascii="Arial" w:eastAsia="Arial" w:hAnsi="Arial" w:cs="Arial"/>
-          <w:sz w:val="22"/>
-          <w:szCs w:val="22"/>
-          <w:lang w:val="en-US"/>
-        </w:rPr>
-        <w:t>The OLTP schema is fully normalized to Third Normal Form (3NF) and contains 10 tables. Natural keys are used throughout (e.g. IATA codes, passport numbers) instead of surrogate keys.</w:t>
-      </w:r>
-    </w:p>
-    <w:p>
-      <w:pPr>
-        <w:spacing w:after="120"/>
-        <w:rPr>
-          <w:lang w:val="en-US"/>
-        </w:rPr>
-      </w:pPr>
-    </w:p>
-    <w:p>
-      <w:pPr>
-        <w:spacing w:before="240" w:after="120"/>
-        <w:rPr>
-          <w:lang w:val="en-US"/>
-        </w:rPr>
-      </w:pPr>
-      <w:r>
-        <w:rPr>
-          <w:rFonts w:ascii="Arial" w:eastAsia="Arial" w:hAnsi="Arial" w:cs="Arial"/>
-          <w:b/>
-          <w:bCs/>
-          <w:sz w:val="26"/>
-          <w:szCs w:val="26"/>
-          <w:lang w:val="en-US"/>
-        </w:rPr>
-        <w:t>2. OLAP Database Context</w:t>
-      </w:r>
-    </w:p>
-    <w:p>
-      <w:pPr>
-        <w:spacing w:after="120"/>
-        <w:rPr>
-          <w:lang w:val="en-US"/>
-        </w:rPr>
-      </w:pPr>
-      <w:r>
-        <w:rPr>
-          <w:rFonts w:ascii="Arial" w:eastAsia="Arial" w:hAnsi="Arial" w:cs="Arial"/>
-          <w:sz w:val="22"/>
-          <w:szCs w:val="22"/>
-          <w:lang w:val="en-US"/>
-        </w:rPr>
-        <w:t>The OLAP (Online Analytical Processing) database is a separate data warehouse designed for analytical queries and reporting. It is built as a multidimensional snowflake schema and is stored in a separate database (</w:t>
-      </w:r>
-      <w:proofErr w:type="spellStart"/>
-      <w:r>
-        <w:rPr>
-          <w:rFonts w:ascii="Arial" w:eastAsia="Arial" w:hAnsi="Arial" w:cs="Arial"/>
-          <w:sz w:val="22"/>
-          <w:szCs w:val="22"/>
-          <w:lang w:val="en-US"/>
-        </w:rPr>
-        <w:t>olap</w:t>
-      </w:r>
-      <w:proofErr w:type="spellEnd"/>
-      <w:r>
-        <w:rPr>
-          <w:rFonts w:ascii="Arial" w:eastAsia="Arial" w:hAnsi="Arial" w:cs="Arial"/>
-          <w:sz w:val="22"/>
-          <w:szCs w:val="22"/>
-          <w:lang w:val="en-US"/>
-        </w:rPr>
-        <w:t>) from the OLTP database (</w:t>
-      </w:r>
-      <w:proofErr w:type="spellStart"/>
-      <w:r>
-        <w:rPr>
-          <w:rFonts w:ascii="Arial" w:eastAsia="Arial" w:hAnsi="Arial" w:cs="Arial"/>
-          <w:sz w:val="22"/>
-          <w:szCs w:val="22"/>
-          <w:lang w:val="en-US"/>
-        </w:rPr>
-        <w:t>postgres</w:t>
-      </w:r>
-      <w:proofErr w:type="spellEnd"/>
-      <w:r>
-        <w:rPr>
-          <w:rFonts w:ascii="Arial" w:eastAsia="Arial" w:hAnsi="Arial" w:cs="Arial"/>
-          <w:sz w:val="22"/>
-          <w:szCs w:val="22"/>
-          <w:lang w:val="en-US"/>
-        </w:rPr>
-        <w:t>).</w:t>
-      </w:r>
-    </w:p>
-    <w:p>
-      <w:pPr>
-        <w:spacing w:after="120"/>
-        <w:rPr>
-          <w:lang w:val="en-US"/>
-        </w:rPr>
-      </w:pPr>
-      <w:r>
-        <w:rPr>
-          <w:rFonts w:ascii="Arial" w:eastAsia="Arial" w:hAnsi="Arial" w:cs="Arial"/>
-          <w:sz w:val="22"/>
-          <w:szCs w:val="22"/>
-          <w:lang w:val="en-US"/>
-        </w:rPr>
-        <w:t>Analytical questions the OLAP database answers:</w:t>
-      </w:r>
-    </w:p>
-    <w:p>
-      <w:pPr>
         <w:pStyle w:val="a4"/>
         <w:numPr>
           <w:ilvl w:val="0"/>
@@ -364,7 +243,7 @@
           <w:szCs w:val="22"/>
           <w:lang w:val="en-US"/>
         </w:rPr>
-        <w:t>What is the total revenue per month, quarter, and year?</w:t>
+        <w:t>Services: ancillary services available for purchase (baggage, meals, seat upgrades, insurance, etc.).</w:t>
       </w:r>
     </w:p>
     <w:p>
@@ -386,7 +265,128 @@
           <w:szCs w:val="22"/>
           <w:lang w:val="en-US"/>
         </w:rPr>
-        <w:t>Which airlines generate the most revenue and sell the most tickets?</w:t>
+        <w:t>Ticket services: records of which services were purchased per ticket, including quantity and price paid.</w:t>
+      </w:r>
+    </w:p>
+    <w:p>
+      <w:pPr>
+        <w:spacing w:after="120"/>
+        <w:rPr>
+          <w:rFonts w:ascii="Arial" w:eastAsia="Arial" w:hAnsi="Arial" w:cs="Arial"/>
+          <w:sz w:val="22"/>
+          <w:szCs w:val="22"/>
+          <w:lang w:val="en-US"/>
+        </w:rPr>
+      </w:pPr>
+      <w:r>
+        <w:rPr>
+          <w:rFonts w:ascii="Arial" w:eastAsia="Arial" w:hAnsi="Arial" w:cs="Arial"/>
+          <w:sz w:val="22"/>
+          <w:szCs w:val="22"/>
+          <w:lang w:val="en-US"/>
+        </w:rPr>
+        <w:t>The OLTP schema is fully normalized to Third Normal Form (3NF) and contains 12 tables. Natural keys are used throughout (e.g. IATA codes, passport numbers) instead of surrogate keys.</w:t>
+      </w:r>
+    </w:p>
+    <w:p>
+      <w:pPr>
+        <w:spacing w:after="120"/>
+        <w:rPr>
+          <w:lang w:val="en-US"/>
+        </w:rPr>
+      </w:pPr>
+    </w:p>
+    <w:p>
+      <w:pPr>
+        <w:spacing w:before="240" w:after="120"/>
+        <w:rPr>
+          <w:lang w:val="en-US"/>
+        </w:rPr>
+      </w:pPr>
+      <w:r>
+        <w:rPr>
+          <w:rFonts w:ascii="Arial" w:eastAsia="Arial" w:hAnsi="Arial" w:cs="Arial"/>
+          <w:b/>
+          <w:bCs/>
+          <w:sz w:val="26"/>
+          <w:szCs w:val="26"/>
+          <w:lang w:val="en-US"/>
+        </w:rPr>
+        <w:t>2. OLAP Database Context</w:t>
+      </w:r>
+    </w:p>
+    <w:p>
+      <w:pPr>
+        <w:spacing w:after="120"/>
+        <w:rPr>
+          <w:lang w:val="en-US"/>
+        </w:rPr>
+      </w:pPr>
+      <w:r>
+        <w:rPr>
+          <w:rFonts w:ascii="Arial" w:eastAsia="Arial" w:hAnsi="Arial" w:cs="Arial"/>
+          <w:sz w:val="22"/>
+          <w:szCs w:val="22"/>
+          <w:lang w:val="en-US"/>
+        </w:rPr>
+        <w:t>The OLAP (Online Analytical Processing) database is a separate data warehouse designed for analytical queries and reporting. It is built as a multidimensional snowflake schema and is stored in a separate database (</w:t>
+      </w:r>
+      <w:proofErr w:type="spellStart"/>
+      <w:r>
+        <w:rPr>
+          <w:rFonts w:ascii="Arial" w:eastAsia="Arial" w:hAnsi="Arial" w:cs="Arial"/>
+          <w:sz w:val="22"/>
+          <w:szCs w:val="22"/>
+          <w:lang w:val="en-US"/>
+        </w:rPr>
+        <w:t>olap</w:t>
+      </w:r>
+      <w:proofErr w:type="spellEnd"/>
+      <w:r>
+        <w:rPr>
+          <w:rFonts w:ascii="Arial" w:eastAsia="Arial" w:hAnsi="Arial" w:cs="Arial"/>
+          <w:sz w:val="22"/>
+          <w:szCs w:val="22"/>
+          <w:lang w:val="en-US"/>
+        </w:rPr>
+        <w:t>) from the OLTP database (</w:t>
+      </w:r>
+      <w:proofErr w:type="spellStart"/>
+      <w:r>
+        <w:rPr>
+          <w:rFonts w:ascii="Arial" w:eastAsia="Arial" w:hAnsi="Arial" w:cs="Arial"/>
+          <w:sz w:val="22"/>
+          <w:szCs w:val="22"/>
+          <w:lang w:val="en-US"/>
+        </w:rPr>
+        <w:t>postgres</w:t>
+      </w:r>
+      <w:proofErr w:type="spellEnd"/>
+      <w:r>
+        <w:rPr>
+          <w:rFonts w:ascii="Arial" w:eastAsia="Arial" w:hAnsi="Arial" w:cs="Arial"/>
+          <w:sz w:val="22"/>
+          <w:szCs w:val="22"/>
+          <w:lang w:val="en-US"/>
+        </w:rPr>
+        <w:t>).</w:t>
+      </w:r>
+    </w:p>
+    <w:p>
+      <w:pPr>
+        <w:spacing w:after="120"/>
+        <w:rPr>
+          <w:lang w:val="en-US"/>
+        </w:rPr>
+      </w:pPr>
+      <w:r>
+        <w:rPr>
+          <w:rFonts w:ascii="Arial" w:eastAsia="Arial" w:hAnsi="Arial" w:cs="Arial"/>
+          <w:sz w:val="22"/>
+          <w:szCs w:val="22"/>
+          <w:lang w:val="en-US"/>
+        </w:rPr>
+        <w:t>Analytical questions the OLAP database answers:</w:t>
       </w:r>
     </w:p>
     <w:p>
@@ -408,7 +408,7 @@
           <w:szCs w:val="22"/>
           <w:lang w:val="en-US"/>
         </w:rPr>
-        <w:t>Which routes are most popular, broken down by cabin class?</w:t>
+        <w:t>What is the total revenue per month, quarter, and year?</w:t>
       </w:r>
     </w:p>
     <w:p>
@@ -430,7 +430,7 @@
           <w:szCs w:val="22"/>
           <w:lang w:val="en-US"/>
         </w:rPr>
-        <w:t>How does ticket revenue distribute across days of the week?</w:t>
+        <w:t>Which airlines generate the most revenue and sell the most tickets?</w:t>
       </w:r>
     </w:p>
     <w:p>
@@ -452,6 +452,50 @@
           <w:szCs w:val="22"/>
           <w:lang w:val="en-US"/>
         </w:rPr>
+        <w:t>Which routes are most popular, broken down by cabin class?</w:t>
+      </w:r>
+    </w:p>
+    <w:p>
+      <w:pPr>
+        <w:pStyle w:val="a4"/>
+        <w:numPr>
+          <w:ilvl w:val="0"/>
+          <w:numId w:val="2"/>
+        </w:numPr>
+        <w:spacing w:after="60"/>
+        <w:rPr>
+          <w:lang w:val="en-US"/>
+        </w:rPr>
+      </w:pPr>
+      <w:r>
+        <w:rPr>
+          <w:rFonts w:ascii="Arial" w:eastAsia="Arial" w:hAnsi="Arial" w:cs="Arial"/>
+          <w:sz w:val="22"/>
+          <w:szCs w:val="22"/>
+          <w:lang w:val="en-US"/>
+        </w:rPr>
+        <w:t>How does ticket revenue distribute across days of the week?</w:t>
+      </w:r>
+    </w:p>
+    <w:p>
+      <w:pPr>
+        <w:pStyle w:val="a4"/>
+        <w:numPr>
+          <w:ilvl w:val="0"/>
+          <w:numId w:val="2"/>
+        </w:numPr>
+        <w:spacing w:after="60"/>
+        <w:rPr>
+          <w:lang w:val="en-US"/>
+        </w:rPr>
+      </w:pPr>
+      <w:r>
+        <w:rPr>
+          <w:rFonts w:ascii="Arial" w:eastAsia="Arial" w:hAnsi="Arial" w:cs="Arial"/>
+          <w:sz w:val="22"/>
+          <w:szCs w:val="22"/>
+          <w:lang w:val="en-US"/>
+        </w:rPr>
         <w:t>What is the flight performance (delays, tickets sold, revenue) per flight?</w:t>
       </w:r>
     </w:p>
@@ -500,1327 +544,1527 @@
       <w:pPr>
         <w:spacing w:before="240" w:after="120"/>
         <w:rPr>
+          <w:lang w:val="en-US"/>
+        </w:rPr>
+      </w:pPr>
+      <w:r>
+        <w:rPr>
           <w:rFonts w:ascii="Arial" w:eastAsia="Arial" w:hAnsi="Arial" w:cs="Arial"/>
           <w:b/>
           <w:bCs/>
           <w:sz w:val="26"/>
           <w:szCs w:val="26"/>
-        </w:rPr>
+          <w:lang w:val="en-US"/>
+        </w:rPr>
+        <w:lastRenderedPageBreak/>
+        <w:t>3. Schema Description</w:t>
+      </w:r>
+    </w:p>
+    <w:p>
+      <w:pPr>
+        <w:spacing w:before="180" w:after="80"/>
+        <w:rPr>
+          <w:lang w:val="en-US"/>
+        </w:rPr>
+      </w:pPr>
+      <w:r>
+        <w:rPr>
+          <w:rFonts w:ascii="Arial" w:eastAsia="Arial" w:hAnsi="Arial" w:cs="Arial"/>
+          <w:b/>
+          <w:bCs/>
+          <w:sz w:val="24"/>
+          <w:szCs w:val="24"/>
+          <w:lang w:val="en-US"/>
+        </w:rPr>
+        <w:t>3.1 OLTP Tables (3NF, 10 tables)</w:t>
+      </w:r>
+    </w:p>
+    <w:p>
+      <w:pPr>
+        <w:spacing w:after="120"/>
+        <w:rPr>
+          <w:lang w:val="en-US"/>
+        </w:rPr>
+      </w:pPr>
+      <w:r>
+        <w:rPr>
+          <w:rFonts w:ascii="Arial" w:eastAsia="Arial" w:hAnsi="Arial" w:cs="Arial"/>
+          <w:sz w:val="22"/>
+          <w:szCs w:val="22"/>
+          <w:lang w:val="en-US"/>
+        </w:rPr>
+        <w:t xml:space="preserve">country - primary key: </w:t>
+      </w:r>
+      <w:proofErr w:type="spellStart"/>
+      <w:r>
+        <w:rPr>
+          <w:rFonts w:ascii="Arial" w:eastAsia="Arial" w:hAnsi="Arial" w:cs="Arial"/>
+          <w:sz w:val="22"/>
+          <w:szCs w:val="22"/>
+          <w:lang w:val="en-US"/>
+        </w:rPr>
+        <w:t>country_code</w:t>
+      </w:r>
+      <w:proofErr w:type="spellEnd"/>
+      <w:r>
+        <w:rPr>
+          <w:rFonts w:ascii="Arial" w:eastAsia="Arial" w:hAnsi="Arial" w:cs="Arial"/>
+          <w:sz w:val="22"/>
+          <w:szCs w:val="22"/>
+          <w:lang w:val="en-US"/>
+        </w:rPr>
+        <w:t xml:space="preserve"> - stores countries using ISO codes</w:t>
+      </w:r>
+    </w:p>
+    <w:p>
+      <w:pPr>
+        <w:spacing w:after="120"/>
+        <w:rPr>
+          <w:lang w:val="en-US"/>
+        </w:rPr>
+      </w:pPr>
+      <w:r>
+        <w:rPr>
+          <w:rFonts w:ascii="Arial" w:eastAsia="Arial" w:hAnsi="Arial" w:cs="Arial"/>
+          <w:sz w:val="22"/>
+          <w:szCs w:val="22"/>
+          <w:lang w:val="en-US"/>
+        </w:rPr>
+        <w:t xml:space="preserve">city - primary key: </w:t>
+      </w:r>
+      <w:proofErr w:type="spellStart"/>
+      <w:r>
+        <w:rPr>
+          <w:rFonts w:ascii="Arial" w:eastAsia="Arial" w:hAnsi="Arial" w:cs="Arial"/>
+          <w:sz w:val="22"/>
+          <w:szCs w:val="22"/>
+          <w:lang w:val="en-US"/>
+        </w:rPr>
+        <w:t>city_code</w:t>
+      </w:r>
+      <w:proofErr w:type="spellEnd"/>
+      <w:r>
+        <w:rPr>
+          <w:rFonts w:ascii="Arial" w:eastAsia="Arial" w:hAnsi="Arial" w:cs="Arial"/>
+          <w:sz w:val="22"/>
+          <w:szCs w:val="22"/>
+          <w:lang w:val="en-US"/>
+        </w:rPr>
+        <w:t xml:space="preserve"> - stores cities, references country</w:t>
+      </w:r>
+    </w:p>
+    <w:p>
+      <w:pPr>
+        <w:spacing w:after="120"/>
+        <w:rPr>
+          <w:lang w:val="en-US"/>
+        </w:rPr>
+      </w:pPr>
+      <w:r>
+        <w:rPr>
+          <w:rFonts w:ascii="Arial" w:eastAsia="Arial" w:hAnsi="Arial" w:cs="Arial"/>
+          <w:sz w:val="22"/>
+          <w:szCs w:val="22"/>
+          <w:lang w:val="en-US"/>
+        </w:rPr>
+        <w:t xml:space="preserve">airport - primary key: </w:t>
+      </w:r>
+      <w:proofErr w:type="spellStart"/>
+      <w:r>
+        <w:rPr>
+          <w:rFonts w:ascii="Arial" w:eastAsia="Arial" w:hAnsi="Arial" w:cs="Arial"/>
+          <w:sz w:val="22"/>
+          <w:szCs w:val="22"/>
+          <w:lang w:val="en-US"/>
+        </w:rPr>
+        <w:t>iata_code</w:t>
+      </w:r>
+      <w:proofErr w:type="spellEnd"/>
+      <w:r>
+        <w:rPr>
+          <w:rFonts w:ascii="Arial" w:eastAsia="Arial" w:hAnsi="Arial" w:cs="Arial"/>
+          <w:sz w:val="22"/>
+          <w:szCs w:val="22"/>
+          <w:lang w:val="en-US"/>
+        </w:rPr>
+        <w:t xml:space="preserve"> - stores airports, references city</w:t>
+      </w:r>
+    </w:p>
+    <w:p>
+      <w:pPr>
+        <w:spacing w:after="120"/>
+        <w:rPr>
+          <w:lang w:val="en-US"/>
+        </w:rPr>
+      </w:pPr>
+      <w:r>
+        <w:rPr>
+          <w:rFonts w:ascii="Arial" w:eastAsia="Arial" w:hAnsi="Arial" w:cs="Arial"/>
+          <w:sz w:val="22"/>
+          <w:szCs w:val="22"/>
+          <w:lang w:val="en-US"/>
+        </w:rPr>
+        <w:t xml:space="preserve">airline - primary key: </w:t>
+      </w:r>
+      <w:proofErr w:type="spellStart"/>
+      <w:r>
+        <w:rPr>
+          <w:rFonts w:ascii="Arial" w:eastAsia="Arial" w:hAnsi="Arial" w:cs="Arial"/>
+          <w:sz w:val="22"/>
+          <w:szCs w:val="22"/>
+          <w:lang w:val="en-US"/>
+        </w:rPr>
+        <w:t>iata_code</w:t>
+      </w:r>
+      <w:proofErr w:type="spellEnd"/>
+      <w:r>
+        <w:rPr>
+          <w:rFonts w:ascii="Arial" w:eastAsia="Arial" w:hAnsi="Arial" w:cs="Arial"/>
+          <w:sz w:val="22"/>
+          <w:szCs w:val="22"/>
+          <w:lang w:val="en-US"/>
+        </w:rPr>
+        <w:t xml:space="preserve"> - stores airlines, references country</w:t>
+      </w:r>
+    </w:p>
+    <w:p>
+      <w:pPr>
+        <w:spacing w:after="120"/>
+        <w:rPr>
+          <w:lang w:val="en-US"/>
+        </w:rPr>
+      </w:pPr>
+      <w:r>
+        <w:rPr>
+          <w:rFonts w:ascii="Arial" w:eastAsia="Arial" w:hAnsi="Arial" w:cs="Arial"/>
+          <w:sz w:val="22"/>
+          <w:szCs w:val="22"/>
+          <w:lang w:val="en-US"/>
+        </w:rPr>
+        <w:t xml:space="preserve">aircraft - primary key: </w:t>
+      </w:r>
+      <w:proofErr w:type="spellStart"/>
+      <w:r>
+        <w:rPr>
+          <w:rFonts w:ascii="Arial" w:eastAsia="Arial" w:hAnsi="Arial" w:cs="Arial"/>
+          <w:sz w:val="22"/>
+          <w:szCs w:val="22"/>
+          <w:lang w:val="en-US"/>
+        </w:rPr>
+        <w:t>tail_number</w:t>
+      </w:r>
+      <w:proofErr w:type="spellEnd"/>
+      <w:r>
+        <w:rPr>
+          <w:rFonts w:ascii="Arial" w:eastAsia="Arial" w:hAnsi="Arial" w:cs="Arial"/>
+          <w:sz w:val="22"/>
+          <w:szCs w:val="22"/>
+          <w:lang w:val="en-US"/>
+        </w:rPr>
+        <w:t xml:space="preserve"> - stores aircraft, references airline</w:t>
+      </w:r>
+    </w:p>
+    <w:p>
+      <w:pPr>
+        <w:spacing w:after="120"/>
+        <w:rPr>
+          <w:lang w:val="en-US"/>
+        </w:rPr>
+      </w:pPr>
+      <w:r>
+        <w:rPr>
+          <w:rFonts w:ascii="Arial" w:eastAsia="Arial" w:hAnsi="Arial" w:cs="Arial"/>
+          <w:sz w:val="22"/>
+          <w:szCs w:val="22"/>
+          <w:lang w:val="en-US"/>
+        </w:rPr>
+        <w:t xml:space="preserve">route - primary key: </w:t>
+      </w:r>
+      <w:proofErr w:type="spellStart"/>
+      <w:r>
+        <w:rPr>
+          <w:rFonts w:ascii="Arial" w:eastAsia="Arial" w:hAnsi="Arial" w:cs="Arial"/>
+          <w:sz w:val="22"/>
+          <w:szCs w:val="22"/>
+          <w:lang w:val="en-US"/>
+        </w:rPr>
+        <w:t>route_code</w:t>
+      </w:r>
+      <w:proofErr w:type="spellEnd"/>
+      <w:r>
+        <w:rPr>
+          <w:rFonts w:ascii="Arial" w:eastAsia="Arial" w:hAnsi="Arial" w:cs="Arial"/>
+          <w:sz w:val="22"/>
+          <w:szCs w:val="22"/>
+          <w:lang w:val="en-US"/>
+        </w:rPr>
+        <w:t xml:space="preserve"> - stores routes between two airports</w:t>
+      </w:r>
+    </w:p>
+    <w:p>
+      <w:pPr>
+        <w:spacing w:after="120"/>
+        <w:rPr>
+          <w:lang w:val="en-US"/>
+        </w:rPr>
+      </w:pPr>
+      <w:r>
+        <w:rPr>
+          <w:rFonts w:ascii="Arial" w:eastAsia="Arial" w:hAnsi="Arial" w:cs="Arial"/>
+          <w:sz w:val="22"/>
+          <w:szCs w:val="22"/>
+          <w:lang w:val="en-US"/>
+        </w:rPr>
+        <w:t xml:space="preserve">flight - primary key: </w:t>
+      </w:r>
+      <w:proofErr w:type="spellStart"/>
+      <w:r>
+        <w:rPr>
+          <w:rFonts w:ascii="Arial" w:eastAsia="Arial" w:hAnsi="Arial" w:cs="Arial"/>
+          <w:sz w:val="22"/>
+          <w:szCs w:val="22"/>
+          <w:lang w:val="en-US"/>
+        </w:rPr>
+        <w:t>flight_number</w:t>
+      </w:r>
+      <w:proofErr w:type="spellEnd"/>
+      <w:r>
+        <w:rPr>
+          <w:rFonts w:ascii="Arial" w:eastAsia="Arial" w:hAnsi="Arial" w:cs="Arial"/>
+          <w:sz w:val="22"/>
+          <w:szCs w:val="22"/>
+          <w:lang w:val="en-US"/>
+        </w:rPr>
+        <w:t xml:space="preserve"> + </w:t>
+      </w:r>
+      <w:proofErr w:type="spellStart"/>
+      <w:r>
+        <w:rPr>
+          <w:rFonts w:ascii="Arial" w:eastAsia="Arial" w:hAnsi="Arial" w:cs="Arial"/>
+          <w:sz w:val="22"/>
+          <w:szCs w:val="22"/>
+          <w:lang w:val="en-US"/>
+        </w:rPr>
+        <w:t>scheduled_date</w:t>
+      </w:r>
+      <w:proofErr w:type="spellEnd"/>
+      <w:r>
+        <w:rPr>
+          <w:rFonts w:ascii="Arial" w:eastAsia="Arial" w:hAnsi="Arial" w:cs="Arial"/>
+          <w:sz w:val="22"/>
+          <w:szCs w:val="22"/>
+          <w:lang w:val="en-US"/>
+        </w:rPr>
+        <w:t xml:space="preserve"> - stores scheduled flights</w:t>
+      </w:r>
+    </w:p>
+    <w:p>
+      <w:pPr>
+        <w:spacing w:after="120"/>
+        <w:rPr>
+          <w:lang w:val="en-US"/>
+        </w:rPr>
+      </w:pPr>
+      <w:r>
+        <w:rPr>
+          <w:rFonts w:ascii="Arial" w:eastAsia="Arial" w:hAnsi="Arial" w:cs="Arial"/>
+          <w:sz w:val="22"/>
+          <w:szCs w:val="22"/>
+          <w:lang w:val="en-US"/>
+        </w:rPr>
+        <w:t xml:space="preserve">passenger - primary key: </w:t>
+      </w:r>
+      <w:proofErr w:type="spellStart"/>
+      <w:r>
+        <w:rPr>
+          <w:rFonts w:ascii="Arial" w:eastAsia="Arial" w:hAnsi="Arial" w:cs="Arial"/>
+          <w:sz w:val="22"/>
+          <w:szCs w:val="22"/>
+          <w:lang w:val="en-US"/>
+        </w:rPr>
+        <w:t>passport_number</w:t>
+      </w:r>
+      <w:proofErr w:type="spellEnd"/>
+      <w:r>
+        <w:rPr>
+          <w:rFonts w:ascii="Arial" w:eastAsia="Arial" w:hAnsi="Arial" w:cs="Arial"/>
+          <w:sz w:val="22"/>
+          <w:szCs w:val="22"/>
+          <w:lang w:val="en-US"/>
+        </w:rPr>
+        <w:t xml:space="preserve"> - stores passengers</w:t>
+      </w:r>
+    </w:p>
+    <w:p>
+      <w:pPr>
+        <w:spacing w:after="120"/>
+        <w:rPr>
+          <w:lang w:val="en-US"/>
+        </w:rPr>
+      </w:pPr>
+      <w:r>
+        <w:rPr>
+          <w:rFonts w:ascii="Arial" w:eastAsia="Arial" w:hAnsi="Arial" w:cs="Arial"/>
+          <w:sz w:val="22"/>
+          <w:szCs w:val="22"/>
+          <w:lang w:val="en-US"/>
+        </w:rPr>
+        <w:t xml:space="preserve">booking - primary key: </w:t>
+      </w:r>
+      <w:proofErr w:type="spellStart"/>
+      <w:r>
+        <w:rPr>
+          <w:rFonts w:ascii="Arial" w:eastAsia="Arial" w:hAnsi="Arial" w:cs="Arial"/>
+          <w:sz w:val="22"/>
+          <w:szCs w:val="22"/>
+          <w:lang w:val="en-US"/>
+        </w:rPr>
+        <w:t>booking_ref</w:t>
+      </w:r>
+      <w:proofErr w:type="spellEnd"/>
+      <w:r>
+        <w:rPr>
+          <w:rFonts w:ascii="Arial" w:eastAsia="Arial" w:hAnsi="Arial" w:cs="Arial"/>
+          <w:sz w:val="22"/>
+          <w:szCs w:val="22"/>
+          <w:lang w:val="en-US"/>
+        </w:rPr>
+        <w:t xml:space="preserve"> - stores reservations and payment info</w:t>
+      </w:r>
+    </w:p>
+    <w:p>
+      <w:pPr>
+        <w:spacing w:after="120"/>
+        <w:rPr>
+          <w:lang w:val="en-US"/>
+        </w:rPr>
+      </w:pPr>
+      <w:r>
+        <w:rPr>
+          <w:rFonts w:ascii="Arial" w:eastAsia="Arial" w:hAnsi="Arial" w:cs="Arial"/>
+          <w:sz w:val="22"/>
+          <w:szCs w:val="22"/>
+          <w:lang w:val="en-US"/>
+        </w:rPr>
+        <w:t xml:space="preserve">ticket - primary key: </w:t>
+      </w:r>
+      <w:proofErr w:type="spellStart"/>
+      <w:r>
+        <w:rPr>
+          <w:rFonts w:ascii="Arial" w:eastAsia="Arial" w:hAnsi="Arial" w:cs="Arial"/>
+          <w:sz w:val="22"/>
+          <w:szCs w:val="22"/>
+          <w:lang w:val="en-US"/>
+        </w:rPr>
+        <w:t>ticket_number</w:t>
+      </w:r>
+      <w:proofErr w:type="spellEnd"/>
+      <w:r>
+        <w:rPr>
+          <w:rFonts w:ascii="Arial" w:eastAsia="Arial" w:hAnsi="Arial" w:cs="Arial"/>
+          <w:sz w:val="22"/>
+          <w:szCs w:val="22"/>
+          <w:lang w:val="en-US"/>
+        </w:rPr>
+        <w:t xml:space="preserve"> - stores issued tickets</w:t>
+      </w:r>
+    </w:p>
+    <w:p>
+      <w:pPr>
+        <w:spacing w:after="120"/>
+        <w:rPr>
+          <w:rFonts w:ascii="Arial" w:eastAsia="Arial" w:hAnsi="Arial" w:cs="Arial"/>
+          <w:sz w:val="22"/>
+          <w:szCs w:val="22"/>
+          <w:lang w:val="en-US"/>
+        </w:rPr>
+      </w:pPr>
+      <w:r>
+        <w:rPr>
+          <w:rFonts w:ascii="Arial" w:eastAsia="Arial" w:hAnsi="Arial" w:cs="Arial"/>
+          <w:sz w:val="22"/>
+          <w:szCs w:val="22"/>
+          <w:lang w:val="en-US"/>
+        </w:rPr>
+        <w:t xml:space="preserve">Keys, constraints and relationships: Each table uses a natural primary key. Foreign keys enforce referential integrity. CHECK constraints validate values (e.g. </w:t>
+      </w:r>
+      <w:proofErr w:type="spellStart"/>
+      <w:r>
+        <w:rPr>
+          <w:rFonts w:ascii="Arial" w:eastAsia="Arial" w:hAnsi="Arial" w:cs="Arial"/>
+          <w:sz w:val="22"/>
+          <w:szCs w:val="22"/>
+          <w:lang w:val="en-US"/>
+        </w:rPr>
+        <w:t>cabin_class</w:t>
+      </w:r>
+      <w:proofErr w:type="spellEnd"/>
+      <w:r>
+        <w:rPr>
+          <w:rFonts w:ascii="Arial" w:eastAsia="Arial" w:hAnsi="Arial" w:cs="Arial"/>
+          <w:sz w:val="22"/>
+          <w:szCs w:val="22"/>
+          <w:lang w:val="en-US"/>
+        </w:rPr>
+        <w:t xml:space="preserve"> IN (‘ECONOMY</w:t>
+      </w:r>
+      <w:proofErr w:type="gramStart"/>
+      <w:r>
+        <w:rPr>
+          <w:rFonts w:ascii="Arial" w:eastAsia="Arial" w:hAnsi="Arial" w:cs="Arial"/>
+          <w:sz w:val="22"/>
+          <w:szCs w:val="22"/>
+          <w:lang w:val="en-US"/>
+        </w:rPr>
+        <w:t>’,‘</w:t>
+      </w:r>
+      <w:proofErr w:type="gramEnd"/>
+      <w:r>
+        <w:rPr>
+          <w:rFonts w:ascii="Arial" w:eastAsia="Arial" w:hAnsi="Arial" w:cs="Arial"/>
+          <w:sz w:val="22"/>
+          <w:szCs w:val="22"/>
+          <w:lang w:val="en-US"/>
+        </w:rPr>
+        <w:t xml:space="preserve">BUSINESS’,‘FIRST’), </w:t>
+      </w:r>
+      <w:proofErr w:type="spellStart"/>
+      <w:r>
+        <w:rPr>
+          <w:rFonts w:ascii="Arial" w:eastAsia="Arial" w:hAnsi="Arial" w:cs="Arial"/>
+          <w:sz w:val="22"/>
+          <w:szCs w:val="22"/>
+          <w:lang w:val="en-US"/>
+        </w:rPr>
+        <w:t>delay_minutes</w:t>
+      </w:r>
+      <w:proofErr w:type="spellEnd"/>
+      <w:r>
+        <w:rPr>
+          <w:rFonts w:ascii="Arial" w:eastAsia="Arial" w:hAnsi="Arial" w:cs="Arial"/>
+          <w:sz w:val="22"/>
+          <w:szCs w:val="22"/>
+          <w:lang w:val="en-US"/>
+        </w:rPr>
+        <w:t xml:space="preserve"> &gt;= 0, category IN (‘BAGGAGE’,‘MEAL’,‘SEAT’,‘INSURANCE’,‘PRIORITY’,‘OTHER’)). The route table has a UNIQUE constraint on (</w:t>
+      </w:r>
+      <w:proofErr w:type="spellStart"/>
+      <w:r>
+        <w:rPr>
+          <w:rFonts w:ascii="Arial" w:eastAsia="Arial" w:hAnsi="Arial" w:cs="Arial"/>
+          <w:sz w:val="22"/>
+          <w:szCs w:val="22"/>
+          <w:lang w:val="en-US"/>
+        </w:rPr>
+        <w:t>origin_airport</w:t>
+      </w:r>
+      <w:proofErr w:type="spellEnd"/>
+      <w:r>
+        <w:rPr>
+          <w:rFonts w:ascii="Arial" w:eastAsia="Arial" w:hAnsi="Arial" w:cs="Arial"/>
+          <w:sz w:val="22"/>
+          <w:szCs w:val="22"/>
+          <w:lang w:val="en-US"/>
+        </w:rPr>
+        <w:t xml:space="preserve">, </w:t>
+      </w:r>
+      <w:proofErr w:type="spellStart"/>
+      <w:r>
+        <w:rPr>
+          <w:rFonts w:ascii="Arial" w:eastAsia="Arial" w:hAnsi="Arial" w:cs="Arial"/>
+          <w:sz w:val="22"/>
+          <w:szCs w:val="22"/>
+          <w:lang w:val="en-US"/>
+        </w:rPr>
+        <w:t>destination_airport</w:t>
+      </w:r>
+      <w:proofErr w:type="spellEnd"/>
+      <w:r>
+        <w:rPr>
+          <w:rFonts w:ascii="Arial" w:eastAsia="Arial" w:hAnsi="Arial" w:cs="Arial"/>
+          <w:sz w:val="22"/>
+          <w:szCs w:val="22"/>
+          <w:lang w:val="en-US"/>
+        </w:rPr>
+        <w:t>). The flight table uses a composite primary key (</w:t>
+      </w:r>
+      <w:proofErr w:type="spellStart"/>
+      <w:r>
+        <w:rPr>
+          <w:rFonts w:ascii="Arial" w:eastAsia="Arial" w:hAnsi="Arial" w:cs="Arial"/>
+          <w:sz w:val="22"/>
+          <w:szCs w:val="22"/>
+          <w:lang w:val="en-US"/>
+        </w:rPr>
+        <w:t>flight_number</w:t>
+      </w:r>
+      <w:proofErr w:type="spellEnd"/>
+      <w:r>
+        <w:rPr>
+          <w:rFonts w:ascii="Arial" w:eastAsia="Arial" w:hAnsi="Arial" w:cs="Arial"/>
+          <w:sz w:val="22"/>
+          <w:szCs w:val="22"/>
+          <w:lang w:val="en-US"/>
+        </w:rPr>
+        <w:t xml:space="preserve">, </w:t>
+      </w:r>
+      <w:proofErr w:type="spellStart"/>
+      <w:r>
+        <w:rPr>
+          <w:rFonts w:ascii="Arial" w:eastAsia="Arial" w:hAnsi="Arial" w:cs="Arial"/>
+          <w:sz w:val="22"/>
+          <w:szCs w:val="22"/>
+          <w:lang w:val="en-US"/>
+        </w:rPr>
+        <w:t>scheduled_date</w:t>
+      </w:r>
+      <w:proofErr w:type="spellEnd"/>
+      <w:r>
+        <w:rPr>
+          <w:rFonts w:ascii="Arial" w:eastAsia="Arial" w:hAnsi="Arial" w:cs="Arial"/>
+          <w:sz w:val="22"/>
+          <w:szCs w:val="22"/>
+          <w:lang w:val="en-US"/>
+        </w:rPr>
+        <w:t xml:space="preserve">). The </w:t>
+      </w:r>
+      <w:proofErr w:type="spellStart"/>
+      <w:r>
+        <w:rPr>
+          <w:rFonts w:ascii="Arial" w:eastAsia="Arial" w:hAnsi="Arial" w:cs="Arial"/>
+          <w:sz w:val="22"/>
+          <w:szCs w:val="22"/>
+          <w:lang w:val="en-US"/>
+        </w:rPr>
+        <w:t>ticket_service</w:t>
+      </w:r>
+      <w:proofErr w:type="spellEnd"/>
+      <w:r>
+        <w:rPr>
+          <w:rFonts w:ascii="Arial" w:eastAsia="Arial" w:hAnsi="Arial" w:cs="Arial"/>
+          <w:sz w:val="22"/>
+          <w:szCs w:val="22"/>
+          <w:lang w:val="en-US"/>
+        </w:rPr>
+        <w:t xml:space="preserve"> table uses a composite primary key (</w:t>
+      </w:r>
+      <w:proofErr w:type="spellStart"/>
+      <w:r>
+        <w:rPr>
+          <w:rFonts w:ascii="Arial" w:eastAsia="Arial" w:hAnsi="Arial" w:cs="Arial"/>
+          <w:sz w:val="22"/>
+          <w:szCs w:val="22"/>
+          <w:lang w:val="en-US"/>
+        </w:rPr>
+        <w:t>ticket_number</w:t>
+      </w:r>
+      <w:proofErr w:type="spellEnd"/>
+      <w:r>
+        <w:rPr>
+          <w:rFonts w:ascii="Arial" w:eastAsia="Arial" w:hAnsi="Arial" w:cs="Arial"/>
+          <w:sz w:val="22"/>
+          <w:szCs w:val="22"/>
+          <w:lang w:val="en-US"/>
+        </w:rPr>
+        <w:t xml:space="preserve">, </w:t>
+      </w:r>
+      <w:proofErr w:type="spellStart"/>
+      <w:r>
+        <w:rPr>
+          <w:rFonts w:ascii="Arial" w:eastAsia="Arial" w:hAnsi="Arial" w:cs="Arial"/>
+          <w:sz w:val="22"/>
+          <w:szCs w:val="22"/>
+          <w:lang w:val="en-US"/>
+        </w:rPr>
+        <w:t>service_code</w:t>
+      </w:r>
+      <w:proofErr w:type="spellEnd"/>
+      <w:r>
+        <w:rPr>
+          <w:rFonts w:ascii="Arial" w:eastAsia="Arial" w:hAnsi="Arial" w:cs="Arial"/>
+          <w:sz w:val="22"/>
+          <w:szCs w:val="22"/>
+          <w:lang w:val="en-US"/>
+        </w:rPr>
+        <w:t>).</w:t>
+      </w:r>
+    </w:p>
+    <w:p>
+      <w:pPr>
+        <w:spacing w:after="120"/>
+        <w:rPr>
+          <w:rFonts w:ascii="Arial" w:eastAsia="Arial" w:hAnsi="Arial" w:cs="Arial"/>
+          <w:sz w:val="22"/>
+          <w:szCs w:val="22"/>
+        </w:rPr>
+      </w:pPr>
+    </w:p>
+    <w:p>
+      <w:pPr>
+        <w:spacing w:after="120"/>
+        <w:rPr>
+          <w:lang w:val="en-US"/>
+        </w:rPr>
+      </w:pPr>
+    </w:p>
+    <w:p>
+      <w:pPr>
+        <w:spacing w:before="180" w:after="80"/>
+        <w:rPr>
+          <w:lang w:val="en-US"/>
+        </w:rPr>
+      </w:pPr>
+      <w:r>
+        <w:rPr>
+          <w:rFonts w:ascii="Arial" w:eastAsia="Arial" w:hAnsi="Arial" w:cs="Arial"/>
+          <w:b/>
+          <w:bCs/>
+          <w:sz w:val="24"/>
+          <w:szCs w:val="24"/>
+          <w:lang w:val="en-US"/>
+        </w:rPr>
+        <w:t>3.2 OLAP Tables (Snowflake DWH)</w:t>
+      </w:r>
+    </w:p>
+    <w:p>
+      <w:pPr>
+        <w:spacing w:after="120"/>
+        <w:rPr>
+          <w:lang w:val="en-US"/>
+        </w:rPr>
+      </w:pPr>
+      <w:proofErr w:type="spellStart"/>
+      <w:r>
+        <w:rPr>
+          <w:rFonts w:ascii="Arial" w:eastAsia="Arial" w:hAnsi="Arial" w:cs="Arial"/>
+          <w:sz w:val="22"/>
+          <w:szCs w:val="22"/>
+          <w:lang w:val="en-US"/>
+        </w:rPr>
+        <w:t>dim_country</w:t>
+      </w:r>
+      <w:proofErr w:type="spellEnd"/>
+      <w:r>
+        <w:rPr>
+          <w:rFonts w:ascii="Arial" w:eastAsia="Arial" w:hAnsi="Arial" w:cs="Arial"/>
+          <w:sz w:val="22"/>
+          <w:szCs w:val="22"/>
+          <w:lang w:val="en-US"/>
+        </w:rPr>
+        <w:t xml:space="preserve"> - Dimension - top of route/airline hierarchy</w:t>
+      </w:r>
+    </w:p>
+    <w:p>
+      <w:pPr>
+        <w:spacing w:after="120"/>
+        <w:rPr>
+          <w:lang w:val="en-US"/>
+        </w:rPr>
+      </w:pPr>
+      <w:proofErr w:type="spellStart"/>
+      <w:r>
+        <w:rPr>
+          <w:rFonts w:ascii="Arial" w:eastAsia="Arial" w:hAnsi="Arial" w:cs="Arial"/>
+          <w:sz w:val="22"/>
+          <w:szCs w:val="22"/>
+          <w:lang w:val="en-US"/>
+        </w:rPr>
+        <w:t>dim_city</w:t>
+      </w:r>
+      <w:proofErr w:type="spellEnd"/>
+      <w:r>
+        <w:rPr>
+          <w:rFonts w:ascii="Arial" w:eastAsia="Arial" w:hAnsi="Arial" w:cs="Arial"/>
+          <w:sz w:val="22"/>
+          <w:szCs w:val="22"/>
+          <w:lang w:val="en-US"/>
+        </w:rPr>
+        <w:t xml:space="preserve"> - Dimension - references </w:t>
+      </w:r>
+      <w:proofErr w:type="spellStart"/>
+      <w:r>
+        <w:rPr>
+          <w:rFonts w:ascii="Arial" w:eastAsia="Arial" w:hAnsi="Arial" w:cs="Arial"/>
+          <w:sz w:val="22"/>
+          <w:szCs w:val="22"/>
+          <w:lang w:val="en-US"/>
+        </w:rPr>
+        <w:t>dim_country</w:t>
+      </w:r>
+      <w:proofErr w:type="spellEnd"/>
+    </w:p>
+    <w:p>
+      <w:pPr>
+        <w:spacing w:after="120"/>
+        <w:rPr>
+          <w:lang w:val="en-US"/>
+        </w:rPr>
+      </w:pPr>
+      <w:proofErr w:type="spellStart"/>
+      <w:r>
+        <w:rPr>
+          <w:rFonts w:ascii="Arial" w:eastAsia="Arial" w:hAnsi="Arial" w:cs="Arial"/>
+          <w:sz w:val="22"/>
+          <w:szCs w:val="22"/>
+          <w:lang w:val="en-US"/>
+        </w:rPr>
+        <w:t>dim_airport</w:t>
+      </w:r>
+      <w:proofErr w:type="spellEnd"/>
+      <w:r>
+        <w:rPr>
+          <w:rFonts w:ascii="Arial" w:eastAsia="Arial" w:hAnsi="Arial" w:cs="Arial"/>
+          <w:sz w:val="22"/>
+          <w:szCs w:val="22"/>
+          <w:lang w:val="en-US"/>
+        </w:rPr>
+        <w:t xml:space="preserve"> - Dimension - references </w:t>
+      </w:r>
+      <w:proofErr w:type="spellStart"/>
+      <w:r>
+        <w:rPr>
+          <w:rFonts w:ascii="Arial" w:eastAsia="Arial" w:hAnsi="Arial" w:cs="Arial"/>
+          <w:sz w:val="22"/>
+          <w:szCs w:val="22"/>
+          <w:lang w:val="en-US"/>
+        </w:rPr>
+        <w:t>dim_city</w:t>
+      </w:r>
+      <w:proofErr w:type="spellEnd"/>
+    </w:p>
+    <w:p>
+      <w:pPr>
+        <w:spacing w:after="120"/>
+        <w:rPr>
+          <w:lang w:val="en-US"/>
+        </w:rPr>
+      </w:pPr>
+      <w:proofErr w:type="spellStart"/>
+      <w:r>
+        <w:rPr>
+          <w:rFonts w:ascii="Arial" w:eastAsia="Arial" w:hAnsi="Arial" w:cs="Arial"/>
+          <w:sz w:val="22"/>
+          <w:szCs w:val="22"/>
+          <w:lang w:val="en-US"/>
+        </w:rPr>
+        <w:t>dim_route</w:t>
+      </w:r>
+      <w:proofErr w:type="spellEnd"/>
+      <w:r>
+        <w:rPr>
+          <w:rFonts w:ascii="Arial" w:eastAsia="Arial" w:hAnsi="Arial" w:cs="Arial"/>
+          <w:sz w:val="22"/>
+          <w:szCs w:val="22"/>
+          <w:lang w:val="en-US"/>
+        </w:rPr>
+        <w:t xml:space="preserve"> - Dimension - references </w:t>
+      </w:r>
+      <w:proofErr w:type="spellStart"/>
+      <w:r>
+        <w:rPr>
+          <w:rFonts w:ascii="Arial" w:eastAsia="Arial" w:hAnsi="Arial" w:cs="Arial"/>
+          <w:sz w:val="22"/>
+          <w:szCs w:val="22"/>
+          <w:lang w:val="en-US"/>
+        </w:rPr>
+        <w:t>dim_airport</w:t>
+      </w:r>
+      <w:proofErr w:type="spellEnd"/>
+      <w:r>
+        <w:rPr>
+          <w:rFonts w:ascii="Arial" w:eastAsia="Arial" w:hAnsi="Arial" w:cs="Arial"/>
+          <w:sz w:val="22"/>
+          <w:szCs w:val="22"/>
+          <w:lang w:val="en-US"/>
+        </w:rPr>
+        <w:t xml:space="preserve"> for both origin and destination</w:t>
+      </w:r>
+    </w:p>
+    <w:p>
+      <w:pPr>
+        <w:spacing w:after="120"/>
+        <w:rPr>
+          <w:lang w:val="en-US"/>
+        </w:rPr>
+      </w:pPr>
+      <w:proofErr w:type="spellStart"/>
+      <w:r>
+        <w:rPr>
+          <w:rFonts w:ascii="Arial" w:eastAsia="Arial" w:hAnsi="Arial" w:cs="Arial"/>
+          <w:sz w:val="22"/>
+          <w:szCs w:val="22"/>
+          <w:lang w:val="en-US"/>
+        </w:rPr>
+        <w:t>dim_airline</w:t>
+      </w:r>
+      <w:proofErr w:type="spellEnd"/>
+      <w:r>
+        <w:rPr>
+          <w:rFonts w:ascii="Arial" w:eastAsia="Arial" w:hAnsi="Arial" w:cs="Arial"/>
+          <w:sz w:val="22"/>
+          <w:szCs w:val="22"/>
+          <w:lang w:val="en-US"/>
+        </w:rPr>
+        <w:t xml:space="preserve"> - Dimension - references </w:t>
+      </w:r>
+      <w:proofErr w:type="spellStart"/>
+      <w:r>
+        <w:rPr>
+          <w:rFonts w:ascii="Arial" w:eastAsia="Arial" w:hAnsi="Arial" w:cs="Arial"/>
+          <w:sz w:val="22"/>
+          <w:szCs w:val="22"/>
+          <w:lang w:val="en-US"/>
+        </w:rPr>
+        <w:t>dim_country</w:t>
+      </w:r>
+      <w:proofErr w:type="spellEnd"/>
+    </w:p>
+    <w:p>
+      <w:pPr>
+        <w:spacing w:after="120"/>
+        <w:rPr>
+          <w:lang w:val="en-US"/>
+        </w:rPr>
+      </w:pPr>
+      <w:proofErr w:type="spellStart"/>
+      <w:r>
+        <w:rPr>
+          <w:rFonts w:ascii="Arial" w:eastAsia="Arial" w:hAnsi="Arial" w:cs="Arial"/>
+          <w:sz w:val="22"/>
+          <w:szCs w:val="22"/>
+          <w:lang w:val="en-US"/>
+        </w:rPr>
+        <w:t>dim_aircraft</w:t>
+      </w:r>
+      <w:proofErr w:type="spellEnd"/>
+      <w:r>
+        <w:rPr>
+          <w:rFonts w:ascii="Arial" w:eastAsia="Arial" w:hAnsi="Arial" w:cs="Arial"/>
+          <w:sz w:val="22"/>
+          <w:szCs w:val="22"/>
+          <w:lang w:val="en-US"/>
+        </w:rPr>
+        <w:t xml:space="preserve"> - Dimension - aircraft details including seats per cabin class</w:t>
+      </w:r>
+    </w:p>
+    <w:p>
+      <w:pPr>
+        <w:spacing w:after="120"/>
+        <w:rPr>
+          <w:lang w:val="en-US"/>
+        </w:rPr>
+      </w:pPr>
+      <w:proofErr w:type="spellStart"/>
+      <w:r>
+        <w:rPr>
+          <w:rFonts w:ascii="Arial" w:eastAsia="Arial" w:hAnsi="Arial" w:cs="Arial"/>
+          <w:sz w:val="22"/>
+          <w:szCs w:val="22"/>
+          <w:lang w:val="en-US"/>
+        </w:rPr>
+        <w:t>dim_time</w:t>
+      </w:r>
+      <w:proofErr w:type="spellEnd"/>
+      <w:r>
+        <w:rPr>
+          <w:rFonts w:ascii="Arial" w:eastAsia="Arial" w:hAnsi="Arial" w:cs="Arial"/>
+          <w:sz w:val="22"/>
+          <w:szCs w:val="22"/>
+          <w:lang w:val="en-US"/>
+        </w:rPr>
+        <w:t xml:space="preserve"> - Dimension - date hierarchy (day, month, quarter, year)</w:t>
+      </w:r>
+    </w:p>
+    <w:p>
+      <w:pPr>
+        <w:spacing w:after="120"/>
+        <w:rPr>
+          <w:lang w:val="en-US"/>
+        </w:rPr>
+      </w:pPr>
+      <w:proofErr w:type="spellStart"/>
+      <w:r>
+        <w:rPr>
+          <w:rFonts w:ascii="Arial" w:eastAsia="Arial" w:hAnsi="Arial" w:cs="Arial"/>
+          <w:sz w:val="22"/>
+          <w:szCs w:val="22"/>
+          <w:lang w:val="en-US"/>
+        </w:rPr>
+        <w:t>dim_passenger</w:t>
+      </w:r>
+      <w:proofErr w:type="spellEnd"/>
+      <w:r>
+        <w:rPr>
+          <w:rFonts w:ascii="Arial" w:eastAsia="Arial" w:hAnsi="Arial" w:cs="Arial"/>
+          <w:sz w:val="22"/>
+          <w:szCs w:val="22"/>
+          <w:lang w:val="en-US"/>
+        </w:rPr>
+        <w:t xml:space="preserve"> - SCD Type 2 - passenger with change history (</w:t>
+      </w:r>
+      <w:proofErr w:type="spellStart"/>
+      <w:r>
+        <w:rPr>
+          <w:rFonts w:ascii="Arial" w:eastAsia="Arial" w:hAnsi="Arial" w:cs="Arial"/>
+          <w:sz w:val="22"/>
+          <w:szCs w:val="22"/>
+          <w:lang w:val="en-US"/>
+        </w:rPr>
+        <w:t>valid_from</w:t>
+      </w:r>
+      <w:proofErr w:type="spellEnd"/>
+      <w:r>
+        <w:rPr>
+          <w:rFonts w:ascii="Arial" w:eastAsia="Arial" w:hAnsi="Arial" w:cs="Arial"/>
+          <w:sz w:val="22"/>
+          <w:szCs w:val="22"/>
+          <w:lang w:val="en-US"/>
+        </w:rPr>
+        <w:t xml:space="preserve">, </w:t>
+      </w:r>
+      <w:proofErr w:type="spellStart"/>
+      <w:r>
+        <w:rPr>
+          <w:rFonts w:ascii="Arial" w:eastAsia="Arial" w:hAnsi="Arial" w:cs="Arial"/>
+          <w:sz w:val="22"/>
+          <w:szCs w:val="22"/>
+          <w:lang w:val="en-US"/>
+        </w:rPr>
+        <w:t>valid_to</w:t>
+      </w:r>
+      <w:proofErr w:type="spellEnd"/>
+      <w:r>
+        <w:rPr>
+          <w:rFonts w:ascii="Arial" w:eastAsia="Arial" w:hAnsi="Arial" w:cs="Arial"/>
+          <w:sz w:val="22"/>
+          <w:szCs w:val="22"/>
+          <w:lang w:val="en-US"/>
+        </w:rPr>
+        <w:t xml:space="preserve">, </w:t>
+      </w:r>
+      <w:proofErr w:type="spellStart"/>
+      <w:r>
+        <w:rPr>
+          <w:rFonts w:ascii="Arial" w:eastAsia="Arial" w:hAnsi="Arial" w:cs="Arial"/>
+          <w:sz w:val="22"/>
+          <w:szCs w:val="22"/>
+          <w:lang w:val="en-US"/>
+        </w:rPr>
+        <w:t>is_current</w:t>
+      </w:r>
+      <w:proofErr w:type="spellEnd"/>
+      <w:r>
+        <w:rPr>
+          <w:rFonts w:ascii="Arial" w:eastAsia="Arial" w:hAnsi="Arial" w:cs="Arial"/>
+          <w:sz w:val="22"/>
+          <w:szCs w:val="22"/>
+          <w:lang w:val="en-US"/>
+        </w:rPr>
+        <w:t>)</w:t>
+      </w:r>
+    </w:p>
+    <w:p>
+      <w:pPr>
+        <w:spacing w:after="120"/>
+        <w:rPr>
+          <w:lang w:val="en-US"/>
+        </w:rPr>
+      </w:pPr>
+      <w:proofErr w:type="spellStart"/>
+      <w:r>
+        <w:rPr>
+          <w:rFonts w:ascii="Arial" w:eastAsia="Arial" w:hAnsi="Arial" w:cs="Arial"/>
+          <w:sz w:val="22"/>
+          <w:szCs w:val="22"/>
+          <w:lang w:val="en-US"/>
+        </w:rPr>
+        <w:t>dim_service</w:t>
+      </w:r>
+      <w:proofErr w:type="spellEnd"/>
+      <w:r>
+        <w:rPr>
+          <w:rFonts w:ascii="Arial" w:eastAsia="Arial" w:hAnsi="Arial" w:cs="Arial"/>
+          <w:sz w:val="22"/>
+          <w:szCs w:val="22"/>
+          <w:lang w:val="en-US"/>
+        </w:rPr>
+        <w:t xml:space="preserve"> - Dimension - ancillary services with category and base price</w:t>
+      </w:r>
+    </w:p>
+    <w:p>
+      <w:pPr>
+        <w:spacing w:after="120"/>
+        <w:rPr>
+          <w:lang w:val="en-US"/>
+        </w:rPr>
+      </w:pPr>
+      <w:proofErr w:type="spellStart"/>
+      <w:r>
+        <w:rPr>
+          <w:rFonts w:ascii="Arial" w:eastAsia="Arial" w:hAnsi="Arial" w:cs="Arial"/>
+          <w:sz w:val="22"/>
+          <w:szCs w:val="22"/>
+          <w:lang w:val="en-US"/>
+        </w:rPr>
+        <w:t>fact_ticket_sales</w:t>
+      </w:r>
+      <w:proofErr w:type="spellEnd"/>
+      <w:r>
+        <w:rPr>
+          <w:rFonts w:ascii="Arial" w:eastAsia="Arial" w:hAnsi="Arial" w:cs="Arial"/>
+          <w:sz w:val="22"/>
+          <w:szCs w:val="22"/>
+          <w:lang w:val="en-US"/>
+        </w:rPr>
+        <w:t xml:space="preserve"> - Fact - one row per ticket sold (price, baggage, payment info)</w:t>
+      </w:r>
+    </w:p>
+    <w:p>
+      <w:pPr>
+        <w:spacing w:after="120"/>
+        <w:rPr>
+          <w:lang w:val="en-US"/>
+        </w:rPr>
+      </w:pPr>
+      <w:proofErr w:type="spellStart"/>
+      <w:r>
+        <w:rPr>
+          <w:rFonts w:ascii="Arial" w:eastAsia="Arial" w:hAnsi="Arial" w:cs="Arial"/>
+          <w:sz w:val="22"/>
+          <w:szCs w:val="22"/>
+          <w:lang w:val="en-US"/>
+        </w:rPr>
+        <w:t>fact_flight_performance</w:t>
+      </w:r>
+      <w:proofErr w:type="spellEnd"/>
+      <w:r>
+        <w:rPr>
+          <w:rFonts w:ascii="Arial" w:eastAsia="Arial" w:hAnsi="Arial" w:cs="Arial"/>
+          <w:sz w:val="22"/>
+          <w:szCs w:val="22"/>
+          <w:lang w:val="en-US"/>
+        </w:rPr>
+        <w:t xml:space="preserve"> - Fact - one row per flight (delay, tickets sold, revenue)</w:t>
+      </w:r>
+    </w:p>
+    <w:p>
+      <w:pPr>
+        <w:spacing w:after="120"/>
+        <w:rPr>
+          <w:lang w:val="en-US"/>
+        </w:rPr>
+      </w:pPr>
+      <w:proofErr w:type="spellStart"/>
+      <w:r>
+        <w:rPr>
+          <w:rFonts w:ascii="Arial" w:eastAsia="Arial" w:hAnsi="Arial" w:cs="Arial"/>
+          <w:sz w:val="22"/>
+          <w:szCs w:val="22"/>
+          <w:lang w:val="en-US"/>
+        </w:rPr>
+        <w:t>bridge_ticket_service</w:t>
+      </w:r>
+      <w:proofErr w:type="spellEnd"/>
+      <w:r>
+        <w:rPr>
+          <w:rFonts w:ascii="Arial" w:eastAsia="Arial" w:hAnsi="Arial" w:cs="Arial"/>
+          <w:sz w:val="22"/>
+          <w:szCs w:val="22"/>
+          <w:lang w:val="en-US"/>
+        </w:rPr>
+        <w:t xml:space="preserve"> - Bridge - links tickets to services with quantity and price paid (M:M)</w:t>
+      </w:r>
+    </w:p>
+    <w:p>
+      <w:pPr>
+        <w:spacing w:after="120"/>
+        <w:rPr>
+          <w:lang w:val="en-US"/>
+        </w:rPr>
+      </w:pPr>
+      <w:proofErr w:type="spellStart"/>
+      <w:r>
+        <w:rPr>
+          <w:rFonts w:ascii="Arial" w:eastAsia="Arial" w:hAnsi="Arial" w:cs="Arial"/>
+          <w:sz w:val="22"/>
+          <w:szCs w:val="22"/>
+          <w:lang w:val="en-US"/>
+        </w:rPr>
+        <w:t>fact_ticket_service</w:t>
+      </w:r>
+      <w:proofErr w:type="spellEnd"/>
+      <w:r>
+        <w:rPr>
+          <w:rFonts w:ascii="Arial" w:eastAsia="Arial" w:hAnsi="Arial" w:cs="Arial"/>
+          <w:sz w:val="22"/>
+          <w:szCs w:val="22"/>
+          <w:lang w:val="en-US"/>
+        </w:rPr>
+        <w:t xml:space="preserve"> - Fact - one row per ticket-service combination with time and passenger context</w:t>
+      </w:r>
+    </w:p>
+    <w:p>
+      <w:pPr>
+        <w:spacing w:after="120"/>
+        <w:rPr>
+          <w:lang w:val="en-US"/>
+        </w:rPr>
+      </w:pPr>
+      <w:r>
+        <w:rPr>
+          <w:rFonts w:ascii="Arial" w:eastAsia="Arial" w:hAnsi="Arial" w:cs="Arial"/>
+          <w:sz w:val="22"/>
+          <w:szCs w:val="22"/>
+          <w:lang w:val="en-US"/>
+        </w:rPr>
+        <w:lastRenderedPageBreak/>
+        <w:t xml:space="preserve">Snowflake normalization: dimensions form hierarchies via surrogate keys. For example, </w:t>
+      </w:r>
+      <w:proofErr w:type="spellStart"/>
+      <w:r>
+        <w:rPr>
+          <w:rFonts w:ascii="Arial" w:eastAsia="Arial" w:hAnsi="Arial" w:cs="Arial"/>
+          <w:sz w:val="22"/>
+          <w:szCs w:val="22"/>
+          <w:lang w:val="en-US"/>
+        </w:rPr>
+        <w:t>fact_ticket_sales</w:t>
+      </w:r>
+      <w:proofErr w:type="spellEnd"/>
+      <w:r>
+        <w:rPr>
+          <w:rFonts w:ascii="Arial" w:eastAsia="Arial" w:hAnsi="Arial" w:cs="Arial"/>
+          <w:sz w:val="22"/>
+          <w:szCs w:val="22"/>
+          <w:lang w:val="en-US"/>
+        </w:rPr>
+        <w:t xml:space="preserve"> references </w:t>
+      </w:r>
+      <w:proofErr w:type="spellStart"/>
+      <w:r>
+        <w:rPr>
+          <w:rFonts w:ascii="Arial" w:eastAsia="Arial" w:hAnsi="Arial" w:cs="Arial"/>
+          <w:sz w:val="22"/>
+          <w:szCs w:val="22"/>
+          <w:lang w:val="en-US"/>
+        </w:rPr>
+        <w:t>dim_route</w:t>
+      </w:r>
+      <w:proofErr w:type="spellEnd"/>
+      <w:r>
+        <w:rPr>
+          <w:rFonts w:ascii="Arial" w:eastAsia="Arial" w:hAnsi="Arial" w:cs="Arial"/>
+          <w:sz w:val="22"/>
+          <w:szCs w:val="22"/>
+          <w:lang w:val="en-US"/>
+        </w:rPr>
+        <w:t xml:space="preserve">, which references </w:t>
+      </w:r>
+      <w:proofErr w:type="spellStart"/>
+      <w:r>
+        <w:rPr>
+          <w:rFonts w:ascii="Arial" w:eastAsia="Arial" w:hAnsi="Arial" w:cs="Arial"/>
+          <w:sz w:val="22"/>
+          <w:szCs w:val="22"/>
+          <w:lang w:val="en-US"/>
+        </w:rPr>
+        <w:t>dim_airport</w:t>
+      </w:r>
+      <w:proofErr w:type="spellEnd"/>
+      <w:r>
+        <w:rPr>
+          <w:rFonts w:ascii="Arial" w:eastAsia="Arial" w:hAnsi="Arial" w:cs="Arial"/>
+          <w:sz w:val="22"/>
+          <w:szCs w:val="22"/>
+          <w:lang w:val="en-US"/>
+        </w:rPr>
+        <w:t xml:space="preserve">, which references </w:t>
+      </w:r>
+      <w:proofErr w:type="spellStart"/>
+      <w:r>
+        <w:rPr>
+          <w:rFonts w:ascii="Arial" w:eastAsia="Arial" w:hAnsi="Arial" w:cs="Arial"/>
+          <w:sz w:val="22"/>
+          <w:szCs w:val="22"/>
+          <w:lang w:val="en-US"/>
+        </w:rPr>
+        <w:t>dim_city</w:t>
+      </w:r>
+      <w:proofErr w:type="spellEnd"/>
+      <w:r>
+        <w:rPr>
+          <w:rFonts w:ascii="Arial" w:eastAsia="Arial" w:hAnsi="Arial" w:cs="Arial"/>
+          <w:sz w:val="22"/>
+          <w:szCs w:val="22"/>
+          <w:lang w:val="en-US"/>
+        </w:rPr>
+        <w:t xml:space="preserve">, which references </w:t>
+      </w:r>
+      <w:proofErr w:type="spellStart"/>
+      <w:r>
+        <w:rPr>
+          <w:rFonts w:ascii="Arial" w:eastAsia="Arial" w:hAnsi="Arial" w:cs="Arial"/>
+          <w:sz w:val="22"/>
+          <w:szCs w:val="22"/>
+          <w:lang w:val="en-US"/>
+        </w:rPr>
+        <w:t>dim_country</w:t>
+      </w:r>
+      <w:proofErr w:type="spellEnd"/>
+      <w:r>
+        <w:rPr>
+          <w:rFonts w:ascii="Arial" w:eastAsia="Arial" w:hAnsi="Arial" w:cs="Arial"/>
+          <w:sz w:val="22"/>
+          <w:szCs w:val="22"/>
+          <w:lang w:val="en-US"/>
+        </w:rPr>
+        <w:t>. The two main fact tables store aggregations (</w:t>
+      </w:r>
+      <w:proofErr w:type="spellStart"/>
+      <w:r>
+        <w:rPr>
+          <w:rFonts w:ascii="Arial" w:eastAsia="Arial" w:hAnsi="Arial" w:cs="Arial"/>
+          <w:sz w:val="22"/>
+          <w:szCs w:val="22"/>
+          <w:lang w:val="en-US"/>
+        </w:rPr>
+        <w:t>tickets_sold</w:t>
+      </w:r>
+      <w:proofErr w:type="spellEnd"/>
+      <w:r>
+        <w:rPr>
+          <w:rFonts w:ascii="Arial" w:eastAsia="Arial" w:hAnsi="Arial" w:cs="Arial"/>
+          <w:sz w:val="22"/>
+          <w:szCs w:val="22"/>
+          <w:lang w:val="en-US"/>
+        </w:rPr>
+        <w:t xml:space="preserve">, </w:t>
+      </w:r>
+      <w:proofErr w:type="spellStart"/>
+      <w:r>
+        <w:rPr>
+          <w:rFonts w:ascii="Arial" w:eastAsia="Arial" w:hAnsi="Arial" w:cs="Arial"/>
+          <w:sz w:val="22"/>
+          <w:szCs w:val="22"/>
+          <w:lang w:val="en-US"/>
+        </w:rPr>
+        <w:t>total_revenue</w:t>
+      </w:r>
+      <w:proofErr w:type="spellEnd"/>
+      <w:r>
+        <w:rPr>
+          <w:rFonts w:ascii="Arial" w:eastAsia="Arial" w:hAnsi="Arial" w:cs="Arial"/>
+          <w:sz w:val="22"/>
+          <w:szCs w:val="22"/>
+          <w:lang w:val="en-US"/>
+        </w:rPr>
+        <w:t>) that do not exist in the OLTP database.</w:t>
+      </w:r>
+    </w:p>
+    <w:p>
+      <w:pPr>
+        <w:spacing w:after="120"/>
+        <w:rPr>
+          <w:rFonts w:ascii="Arial" w:eastAsia="Arial" w:hAnsi="Arial" w:cs="Arial"/>
+          <w:sz w:val="22"/>
+          <w:szCs w:val="22"/>
+        </w:rPr>
+      </w:pPr>
+      <w:r>
+        <w:rPr>
+          <w:rFonts w:ascii="Arial" w:eastAsia="Arial" w:hAnsi="Arial" w:cs="Arial"/>
+          <w:sz w:val="22"/>
+          <w:szCs w:val="22"/>
+          <w:lang w:val="en-US"/>
+        </w:rPr>
+        <w:t xml:space="preserve">Bridge table: </w:t>
+      </w:r>
+      <w:proofErr w:type="spellStart"/>
+      <w:r>
+        <w:rPr>
+          <w:rFonts w:ascii="Arial" w:eastAsia="Arial" w:hAnsi="Arial" w:cs="Arial"/>
+          <w:sz w:val="22"/>
+          <w:szCs w:val="22"/>
+          <w:lang w:val="en-US"/>
+        </w:rPr>
+        <w:t>bridge_ticket_service</w:t>
+      </w:r>
+      <w:proofErr w:type="spellEnd"/>
+      <w:r>
+        <w:rPr>
+          <w:rFonts w:ascii="Arial" w:eastAsia="Arial" w:hAnsi="Arial" w:cs="Arial"/>
+          <w:sz w:val="22"/>
+          <w:szCs w:val="22"/>
+          <w:lang w:val="en-US"/>
+        </w:rPr>
+        <w:t xml:space="preserve"> resolves the many-to-many relationship between tickets and services. It stores quantity and </w:t>
+      </w:r>
+      <w:proofErr w:type="spellStart"/>
+      <w:r>
+        <w:rPr>
+          <w:rFonts w:ascii="Arial" w:eastAsia="Arial" w:hAnsi="Arial" w:cs="Arial"/>
+          <w:sz w:val="22"/>
+          <w:szCs w:val="22"/>
+          <w:lang w:val="en-US"/>
+        </w:rPr>
+        <w:t>price_paid</w:t>
+      </w:r>
+      <w:proofErr w:type="spellEnd"/>
+      <w:r>
+        <w:rPr>
+          <w:rFonts w:ascii="Arial" w:eastAsia="Arial" w:hAnsi="Arial" w:cs="Arial"/>
+          <w:sz w:val="22"/>
+          <w:szCs w:val="22"/>
+          <w:lang w:val="en-US"/>
+        </w:rPr>
+        <w:t xml:space="preserve"> directly, making it the authoritative source for service purchase data. </w:t>
+      </w:r>
+      <w:proofErr w:type="spellStart"/>
+      <w:r>
+        <w:rPr>
+          <w:rFonts w:ascii="Arial" w:eastAsia="Arial" w:hAnsi="Arial" w:cs="Arial"/>
+          <w:sz w:val="22"/>
+          <w:szCs w:val="22"/>
+          <w:lang w:val="en-US"/>
+        </w:rPr>
+        <w:t>fact_ticket_service</w:t>
+      </w:r>
+      <w:proofErr w:type="spellEnd"/>
+      <w:r>
+        <w:rPr>
+          <w:rFonts w:ascii="Arial" w:eastAsia="Arial" w:hAnsi="Arial" w:cs="Arial"/>
+          <w:sz w:val="22"/>
+          <w:szCs w:val="22"/>
+          <w:lang w:val="en-US"/>
+        </w:rPr>
+        <w:t xml:space="preserve"> references this bridge and enriches it with time and passenger context for analytical queries.</w:t>
+      </w:r>
+    </w:p>
+    <w:p>
+      <w:pPr>
+        <w:spacing w:after="120"/>
+        <w:rPr>
+          <w:rFonts w:ascii="Arial" w:eastAsia="Arial" w:hAnsi="Arial" w:cs="Arial"/>
+          <w:sz w:val="22"/>
+          <w:szCs w:val="22"/>
+        </w:rPr>
+      </w:pPr>
+    </w:p>
+    <w:p>
+      <w:pPr>
+        <w:spacing w:after="120"/>
       </w:pPr>
     </w:p>
     <w:p>
       <w:pPr>
         <w:spacing w:before="240" w:after="120"/>
+        <w:rPr>
+          <w:lang w:val="en-US"/>
+        </w:rPr>
+      </w:pPr>
+      <w:r>
         <w:rPr>
           <w:rFonts w:ascii="Arial" w:eastAsia="Arial" w:hAnsi="Arial" w:cs="Arial"/>
           <w:b/>
           <w:bCs/>
           <w:sz w:val="26"/>
           <w:szCs w:val="26"/>
-        </w:rPr>
-      </w:pPr>
-    </w:p>
-    <w:p>
-      <w:pPr>
-        <w:spacing w:before="240" w:after="120"/>
-        <w:rPr>
-          <w:lang w:val="en-US"/>
-        </w:rPr>
-      </w:pPr>
-      <w:r>
-        <w:rPr>
-          <w:rFonts w:ascii="Arial" w:eastAsia="Arial" w:hAnsi="Arial" w:cs="Arial"/>
-          <w:b/>
-          <w:bCs/>
-          <w:sz w:val="26"/>
-          <w:szCs w:val="26"/>
-          <w:lang w:val="en-US"/>
-        </w:rPr>
-        <w:lastRenderedPageBreak/>
-        <w:t>3. Schema Description</w:t>
+          <w:lang w:val="en-US"/>
+        </w:rPr>
+        <w:t>4. Instructions: Which Scripts to Run and How</w:t>
+      </w:r>
+    </w:p>
+    <w:p>
+      <w:pPr>
+        <w:spacing w:after="120"/>
+        <w:rPr>
+          <w:lang w:val="en-US"/>
+        </w:rPr>
+      </w:pPr>
+      <w:r>
+        <w:rPr>
+          <w:rFonts w:ascii="Arial" w:eastAsia="Arial" w:hAnsi="Arial" w:cs="Arial"/>
+          <w:sz w:val="22"/>
+          <w:szCs w:val="22"/>
+          <w:lang w:val="en-US"/>
+        </w:rPr>
+        <w:t xml:space="preserve">All scripts are executed in </w:t>
+      </w:r>
+      <w:proofErr w:type="spellStart"/>
+      <w:r>
+        <w:rPr>
+          <w:rFonts w:ascii="Arial" w:eastAsia="Arial" w:hAnsi="Arial" w:cs="Arial"/>
+          <w:sz w:val="22"/>
+          <w:szCs w:val="22"/>
+          <w:lang w:val="en-US"/>
+        </w:rPr>
+        <w:t>pgAdmin</w:t>
+      </w:r>
+      <w:proofErr w:type="spellEnd"/>
+      <w:r>
+        <w:rPr>
+          <w:rFonts w:ascii="Arial" w:eastAsia="Arial" w:hAnsi="Arial" w:cs="Arial"/>
+          <w:sz w:val="22"/>
+          <w:szCs w:val="22"/>
+          <w:lang w:val="en-US"/>
+        </w:rPr>
+        <w:t xml:space="preserve"> (Query Tool). The OLTP database is named </w:t>
+      </w:r>
+      <w:proofErr w:type="spellStart"/>
+      <w:r>
+        <w:rPr>
+          <w:rFonts w:ascii="Arial" w:eastAsia="Arial" w:hAnsi="Arial" w:cs="Arial"/>
+          <w:sz w:val="22"/>
+          <w:szCs w:val="22"/>
+          <w:lang w:val="en-US"/>
+        </w:rPr>
+        <w:t>postgres</w:t>
+      </w:r>
+      <w:proofErr w:type="spellEnd"/>
+      <w:r>
+        <w:rPr>
+          <w:rFonts w:ascii="Arial" w:eastAsia="Arial" w:hAnsi="Arial" w:cs="Arial"/>
+          <w:sz w:val="22"/>
+          <w:szCs w:val="22"/>
+          <w:lang w:val="en-US"/>
+        </w:rPr>
+        <w:t xml:space="preserve"> and the OLAP database is named </w:t>
+      </w:r>
+      <w:proofErr w:type="spellStart"/>
+      <w:r>
+        <w:rPr>
+          <w:rFonts w:ascii="Arial" w:eastAsia="Arial" w:hAnsi="Arial" w:cs="Arial"/>
+          <w:sz w:val="22"/>
+          <w:szCs w:val="22"/>
+          <w:lang w:val="en-US"/>
+        </w:rPr>
+        <w:t>olap</w:t>
+      </w:r>
+      <w:proofErr w:type="spellEnd"/>
+      <w:r>
+        <w:rPr>
+          <w:rFonts w:ascii="Arial" w:eastAsia="Arial" w:hAnsi="Arial" w:cs="Arial"/>
+          <w:sz w:val="22"/>
+          <w:szCs w:val="22"/>
+          <w:lang w:val="en-US"/>
+        </w:rPr>
+        <w:t>. The PostgreSQL server runs on localhost, port 1166.</w:t>
       </w:r>
     </w:p>
     <w:p>
       <w:pPr>
         <w:spacing w:before="180" w:after="80"/>
         <w:rPr>
-          <w:lang w:val="en-US"/>
-        </w:rPr>
-      </w:pPr>
-      <w:r>
-        <w:rPr>
-          <w:rFonts w:ascii="Arial" w:eastAsia="Arial" w:hAnsi="Arial" w:cs="Arial"/>
-          <w:b/>
-          <w:bCs/>
-          <w:sz w:val="24"/>
-          <w:szCs w:val="24"/>
-          <w:lang w:val="en-US"/>
-        </w:rPr>
-        <w:t>3.1 OLTP Tables (3NF, 10 tables)</w:t>
-      </w:r>
-    </w:p>
-    <w:p>
-      <w:pPr>
-        <w:spacing w:after="120"/>
-        <w:rPr>
-          <w:lang w:val="en-US"/>
-        </w:rPr>
-      </w:pPr>
-      <w:r>
-        <w:rPr>
-          <w:rFonts w:ascii="Arial" w:eastAsia="Arial" w:hAnsi="Arial" w:cs="Arial"/>
-          <w:sz w:val="22"/>
-          <w:szCs w:val="22"/>
-          <w:lang w:val="en-US"/>
-        </w:rPr>
-        <w:t xml:space="preserve">country - primary key: </w:t>
-      </w:r>
-      <w:proofErr w:type="spellStart"/>
-      <w:r>
-        <w:rPr>
-          <w:rFonts w:ascii="Arial" w:eastAsia="Arial" w:hAnsi="Arial" w:cs="Arial"/>
-          <w:sz w:val="22"/>
-          <w:szCs w:val="22"/>
-          <w:lang w:val="en-US"/>
-        </w:rPr>
-        <w:t>country_code</w:t>
-      </w:r>
-      <w:proofErr w:type="spellEnd"/>
-      <w:r>
-        <w:rPr>
-          <w:rFonts w:ascii="Arial" w:eastAsia="Arial" w:hAnsi="Arial" w:cs="Arial"/>
-          <w:sz w:val="22"/>
-          <w:szCs w:val="22"/>
-          <w:lang w:val="en-US"/>
-        </w:rPr>
-        <w:t xml:space="preserve"> - stores countries using ISO codes</w:t>
-      </w:r>
-    </w:p>
-    <w:p>
-      <w:pPr>
-        <w:spacing w:after="120"/>
-        <w:rPr>
-          <w:lang w:val="en-US"/>
-        </w:rPr>
-      </w:pPr>
-      <w:r>
-        <w:rPr>
-          <w:rFonts w:ascii="Arial" w:eastAsia="Arial" w:hAnsi="Arial" w:cs="Arial"/>
-          <w:sz w:val="22"/>
-          <w:szCs w:val="22"/>
-          <w:lang w:val="en-US"/>
-        </w:rPr>
-        <w:t xml:space="preserve">city - primary key: </w:t>
-      </w:r>
-      <w:proofErr w:type="spellStart"/>
-      <w:r>
-        <w:rPr>
-          <w:rFonts w:ascii="Arial" w:eastAsia="Arial" w:hAnsi="Arial" w:cs="Arial"/>
-          <w:sz w:val="22"/>
-          <w:szCs w:val="22"/>
-          <w:lang w:val="en-US"/>
-        </w:rPr>
-        <w:t>city_code</w:t>
-      </w:r>
-      <w:proofErr w:type="spellEnd"/>
-      <w:r>
-        <w:rPr>
-          <w:rFonts w:ascii="Arial" w:eastAsia="Arial" w:hAnsi="Arial" w:cs="Arial"/>
-          <w:sz w:val="22"/>
-          <w:szCs w:val="22"/>
-          <w:lang w:val="en-US"/>
-        </w:rPr>
-        <w:t xml:space="preserve"> - stores cities, references country</w:t>
-      </w:r>
-    </w:p>
-    <w:p>
-      <w:pPr>
-        <w:spacing w:after="120"/>
-        <w:rPr>
-          <w:lang w:val="en-US"/>
-        </w:rPr>
-      </w:pPr>
-      <w:r>
-        <w:rPr>
-          <w:rFonts w:ascii="Arial" w:eastAsia="Arial" w:hAnsi="Arial" w:cs="Arial"/>
-          <w:sz w:val="22"/>
-          <w:szCs w:val="22"/>
-          <w:lang w:val="en-US"/>
-        </w:rPr>
-        <w:t xml:space="preserve">airport - primary key: </w:t>
-      </w:r>
-      <w:proofErr w:type="spellStart"/>
-      <w:r>
-        <w:rPr>
-          <w:rFonts w:ascii="Arial" w:eastAsia="Arial" w:hAnsi="Arial" w:cs="Arial"/>
-          <w:sz w:val="22"/>
-          <w:szCs w:val="22"/>
-          <w:lang w:val="en-US"/>
-        </w:rPr>
-        <w:t>iata_code</w:t>
-      </w:r>
-      <w:proofErr w:type="spellEnd"/>
-      <w:r>
-        <w:rPr>
-          <w:rFonts w:ascii="Arial" w:eastAsia="Arial" w:hAnsi="Arial" w:cs="Arial"/>
-          <w:sz w:val="22"/>
-          <w:szCs w:val="22"/>
-          <w:lang w:val="en-US"/>
-        </w:rPr>
-        <w:t xml:space="preserve"> - stores airports, references city</w:t>
-      </w:r>
-    </w:p>
-    <w:p>
-      <w:pPr>
-        <w:spacing w:after="120"/>
-        <w:rPr>
-          <w:lang w:val="en-US"/>
-        </w:rPr>
-      </w:pPr>
-      <w:r>
-        <w:rPr>
-          <w:rFonts w:ascii="Arial" w:eastAsia="Arial" w:hAnsi="Arial" w:cs="Arial"/>
-          <w:sz w:val="22"/>
-          <w:szCs w:val="22"/>
-          <w:lang w:val="en-US"/>
-        </w:rPr>
-        <w:t xml:space="preserve">airline - primary key: </w:t>
-      </w:r>
-      <w:proofErr w:type="spellStart"/>
-      <w:r>
-        <w:rPr>
-          <w:rFonts w:ascii="Arial" w:eastAsia="Arial" w:hAnsi="Arial" w:cs="Arial"/>
-          <w:sz w:val="22"/>
-          <w:szCs w:val="22"/>
-          <w:lang w:val="en-US"/>
-        </w:rPr>
-        <w:t>iata_code</w:t>
-      </w:r>
-      <w:proofErr w:type="spellEnd"/>
-      <w:r>
-        <w:rPr>
-          <w:rFonts w:ascii="Arial" w:eastAsia="Arial" w:hAnsi="Arial" w:cs="Arial"/>
-          <w:sz w:val="22"/>
-          <w:szCs w:val="22"/>
-          <w:lang w:val="en-US"/>
-        </w:rPr>
-        <w:t xml:space="preserve"> - stores airlines, references country</w:t>
-      </w:r>
-    </w:p>
-    <w:p>
-      <w:pPr>
-        <w:spacing w:after="120"/>
-        <w:rPr>
-          <w:lang w:val="en-US"/>
-        </w:rPr>
-      </w:pPr>
-      <w:r>
-        <w:rPr>
-          <w:rFonts w:ascii="Arial" w:eastAsia="Arial" w:hAnsi="Arial" w:cs="Arial"/>
-          <w:sz w:val="22"/>
-          <w:szCs w:val="22"/>
-          <w:lang w:val="en-US"/>
-        </w:rPr>
-        <w:t xml:space="preserve">aircraft - primary key: </w:t>
-      </w:r>
-      <w:proofErr w:type="spellStart"/>
-      <w:r>
-        <w:rPr>
-          <w:rFonts w:ascii="Arial" w:eastAsia="Arial" w:hAnsi="Arial" w:cs="Arial"/>
-          <w:sz w:val="22"/>
-          <w:szCs w:val="22"/>
-          <w:lang w:val="en-US"/>
-        </w:rPr>
-        <w:t>tail_number</w:t>
-      </w:r>
-      <w:proofErr w:type="spellEnd"/>
-      <w:r>
-        <w:rPr>
-          <w:rFonts w:ascii="Arial" w:eastAsia="Arial" w:hAnsi="Arial" w:cs="Arial"/>
-          <w:sz w:val="22"/>
-          <w:szCs w:val="22"/>
-          <w:lang w:val="en-US"/>
-        </w:rPr>
-        <w:t xml:space="preserve"> - stores aircraft, references airline</w:t>
-      </w:r>
-    </w:p>
-    <w:p>
-      <w:pPr>
-        <w:spacing w:after="120"/>
-        <w:rPr>
-          <w:lang w:val="en-US"/>
-        </w:rPr>
-      </w:pPr>
-      <w:r>
-        <w:rPr>
-          <w:rFonts w:ascii="Arial" w:eastAsia="Arial" w:hAnsi="Arial" w:cs="Arial"/>
-          <w:sz w:val="22"/>
-          <w:szCs w:val="22"/>
-          <w:lang w:val="en-US"/>
-        </w:rPr>
-        <w:t xml:space="preserve">route - primary key: </w:t>
-      </w:r>
-      <w:proofErr w:type="spellStart"/>
-      <w:r>
-        <w:rPr>
-          <w:rFonts w:ascii="Arial" w:eastAsia="Arial" w:hAnsi="Arial" w:cs="Arial"/>
-          <w:sz w:val="22"/>
-          <w:szCs w:val="22"/>
-          <w:lang w:val="en-US"/>
-        </w:rPr>
-        <w:t>route_code</w:t>
-      </w:r>
-      <w:proofErr w:type="spellEnd"/>
-      <w:r>
-        <w:rPr>
-          <w:rFonts w:ascii="Arial" w:eastAsia="Arial" w:hAnsi="Arial" w:cs="Arial"/>
-          <w:sz w:val="22"/>
-          <w:szCs w:val="22"/>
-          <w:lang w:val="en-US"/>
-        </w:rPr>
-        <w:t xml:space="preserve"> - stores routes between two airports</w:t>
-      </w:r>
-    </w:p>
-    <w:p>
-      <w:pPr>
-        <w:spacing w:after="120"/>
-        <w:rPr>
-          <w:lang w:val="en-US"/>
-        </w:rPr>
-      </w:pPr>
-      <w:r>
-        <w:rPr>
-          <w:rFonts w:ascii="Arial" w:eastAsia="Arial" w:hAnsi="Arial" w:cs="Arial"/>
-          <w:sz w:val="22"/>
-          <w:szCs w:val="22"/>
-          <w:lang w:val="en-US"/>
-        </w:rPr>
-        <w:t xml:space="preserve">flight - primary key: </w:t>
-      </w:r>
-      <w:proofErr w:type="spellStart"/>
-      <w:r>
-        <w:rPr>
-          <w:rFonts w:ascii="Arial" w:eastAsia="Arial" w:hAnsi="Arial" w:cs="Arial"/>
-          <w:sz w:val="22"/>
-          <w:szCs w:val="22"/>
-          <w:lang w:val="en-US"/>
-        </w:rPr>
-        <w:t>flight_number</w:t>
-      </w:r>
-      <w:proofErr w:type="spellEnd"/>
-      <w:r>
-        <w:rPr>
-          <w:rFonts w:ascii="Arial" w:eastAsia="Arial" w:hAnsi="Arial" w:cs="Arial"/>
-          <w:sz w:val="22"/>
-          <w:szCs w:val="22"/>
-          <w:lang w:val="en-US"/>
-        </w:rPr>
-        <w:t xml:space="preserve"> + </w:t>
-      </w:r>
-      <w:proofErr w:type="spellStart"/>
-      <w:r>
-        <w:rPr>
-          <w:rFonts w:ascii="Arial" w:eastAsia="Arial" w:hAnsi="Arial" w:cs="Arial"/>
-          <w:sz w:val="22"/>
-          <w:szCs w:val="22"/>
-          <w:lang w:val="en-US"/>
-        </w:rPr>
-        <w:t>scheduled_date</w:t>
-      </w:r>
-      <w:proofErr w:type="spellEnd"/>
-      <w:r>
-        <w:rPr>
-          <w:rFonts w:ascii="Arial" w:eastAsia="Arial" w:hAnsi="Arial" w:cs="Arial"/>
-          <w:sz w:val="22"/>
-          <w:szCs w:val="22"/>
-          <w:lang w:val="en-US"/>
-        </w:rPr>
-        <w:t xml:space="preserve"> - stores scheduled flights</w:t>
-      </w:r>
-    </w:p>
-    <w:p>
-      <w:pPr>
-        <w:spacing w:after="120"/>
-        <w:rPr>
-          <w:lang w:val="en-US"/>
-        </w:rPr>
-      </w:pPr>
-      <w:r>
-        <w:rPr>
-          <w:rFonts w:ascii="Arial" w:eastAsia="Arial" w:hAnsi="Arial" w:cs="Arial"/>
-          <w:sz w:val="22"/>
-          <w:szCs w:val="22"/>
-          <w:lang w:val="en-US"/>
-        </w:rPr>
-        <w:t xml:space="preserve">passenger - primary key: </w:t>
-      </w:r>
-      <w:proofErr w:type="spellStart"/>
-      <w:r>
-        <w:rPr>
-          <w:rFonts w:ascii="Arial" w:eastAsia="Arial" w:hAnsi="Arial" w:cs="Arial"/>
-          <w:sz w:val="22"/>
-          <w:szCs w:val="22"/>
-          <w:lang w:val="en-US"/>
-        </w:rPr>
-        <w:t>passport_number</w:t>
-      </w:r>
-      <w:proofErr w:type="spellEnd"/>
-      <w:r>
-        <w:rPr>
-          <w:rFonts w:ascii="Arial" w:eastAsia="Arial" w:hAnsi="Arial" w:cs="Arial"/>
-          <w:sz w:val="22"/>
-          <w:szCs w:val="22"/>
-          <w:lang w:val="en-US"/>
-        </w:rPr>
-        <w:t xml:space="preserve"> - stores passengers</w:t>
-      </w:r>
-    </w:p>
-    <w:p>
-      <w:pPr>
-        <w:spacing w:after="120"/>
-        <w:rPr>
-          <w:lang w:val="en-US"/>
-        </w:rPr>
-      </w:pPr>
-      <w:r>
-        <w:rPr>
-          <w:rFonts w:ascii="Arial" w:eastAsia="Arial" w:hAnsi="Arial" w:cs="Arial"/>
-          <w:sz w:val="22"/>
-          <w:szCs w:val="22"/>
-          <w:lang w:val="en-US"/>
-        </w:rPr>
-        <w:t xml:space="preserve">booking - primary key: </w:t>
-      </w:r>
-      <w:proofErr w:type="spellStart"/>
-      <w:r>
-        <w:rPr>
-          <w:rFonts w:ascii="Arial" w:eastAsia="Arial" w:hAnsi="Arial" w:cs="Arial"/>
-          <w:sz w:val="22"/>
-          <w:szCs w:val="22"/>
-          <w:lang w:val="en-US"/>
-        </w:rPr>
-        <w:t>booking_ref</w:t>
-      </w:r>
-      <w:proofErr w:type="spellEnd"/>
-      <w:r>
-        <w:rPr>
-          <w:rFonts w:ascii="Arial" w:eastAsia="Arial" w:hAnsi="Arial" w:cs="Arial"/>
-          <w:sz w:val="22"/>
-          <w:szCs w:val="22"/>
-          <w:lang w:val="en-US"/>
-        </w:rPr>
-        <w:t xml:space="preserve"> - stores reservations and payment info</w:t>
-      </w:r>
-    </w:p>
-    <w:p>
-      <w:pPr>
-        <w:spacing w:after="120"/>
-        <w:rPr>
-          <w:lang w:val="en-US"/>
-        </w:rPr>
-      </w:pPr>
-      <w:r>
-        <w:rPr>
-          <w:rFonts w:ascii="Arial" w:eastAsia="Arial" w:hAnsi="Arial" w:cs="Arial"/>
-          <w:sz w:val="22"/>
-          <w:szCs w:val="22"/>
-          <w:lang w:val="en-US"/>
-        </w:rPr>
-        <w:t xml:space="preserve">ticket - primary key: </w:t>
-      </w:r>
-      <w:proofErr w:type="spellStart"/>
-      <w:r>
-        <w:rPr>
-          <w:rFonts w:ascii="Arial" w:eastAsia="Arial" w:hAnsi="Arial" w:cs="Arial"/>
-          <w:sz w:val="22"/>
-          <w:szCs w:val="22"/>
-          <w:lang w:val="en-US"/>
-        </w:rPr>
-        <w:t>ticket_number</w:t>
-      </w:r>
-      <w:proofErr w:type="spellEnd"/>
-      <w:r>
-        <w:rPr>
-          <w:rFonts w:ascii="Arial" w:eastAsia="Arial" w:hAnsi="Arial" w:cs="Arial"/>
-          <w:sz w:val="22"/>
-          <w:szCs w:val="22"/>
-          <w:lang w:val="en-US"/>
-        </w:rPr>
-        <w:t xml:space="preserve"> - stores issued tickets</w:t>
-      </w:r>
-    </w:p>
-    <w:p>
-      <w:pPr>
-        <w:spacing w:after="120"/>
-        <w:rPr>
-          <w:rFonts w:ascii="Arial" w:eastAsia="Arial" w:hAnsi="Arial" w:cs="Arial"/>
-          <w:sz w:val="22"/>
-          <w:szCs w:val="22"/>
-        </w:rPr>
-      </w:pPr>
-      <w:r>
-        <w:rPr>
-          <w:rFonts w:ascii="Arial" w:eastAsia="Arial" w:hAnsi="Arial" w:cs="Arial"/>
-          <w:sz w:val="22"/>
-          <w:szCs w:val="22"/>
-          <w:lang w:val="en-US"/>
-        </w:rPr>
-        <w:t xml:space="preserve">Keys, constraints and relationships: Each table uses a natural primary key. Foreign keys enforce referential integrity. CHECK constraints validate values (e.g. </w:t>
-      </w:r>
-      <w:proofErr w:type="spellStart"/>
-      <w:r>
-        <w:rPr>
-          <w:rFonts w:ascii="Arial" w:eastAsia="Arial" w:hAnsi="Arial" w:cs="Arial"/>
-          <w:sz w:val="22"/>
-          <w:szCs w:val="22"/>
-          <w:lang w:val="en-US"/>
-        </w:rPr>
-        <w:t>cabin_class</w:t>
-      </w:r>
-      <w:proofErr w:type="spellEnd"/>
-      <w:r>
-        <w:rPr>
-          <w:rFonts w:ascii="Arial" w:eastAsia="Arial" w:hAnsi="Arial" w:cs="Arial"/>
-          <w:sz w:val="22"/>
-          <w:szCs w:val="22"/>
-          <w:lang w:val="en-US"/>
-        </w:rPr>
-        <w:t xml:space="preserve"> IN ('ECONOMY','BUSINESS','FIRST'), </w:t>
-      </w:r>
-      <w:proofErr w:type="spellStart"/>
-      <w:r>
-        <w:rPr>
-          <w:rFonts w:ascii="Arial" w:eastAsia="Arial" w:hAnsi="Arial" w:cs="Arial"/>
-          <w:sz w:val="22"/>
-          <w:szCs w:val="22"/>
-          <w:lang w:val="en-US"/>
-        </w:rPr>
-        <w:t>delay_minutes</w:t>
-      </w:r>
-      <w:proofErr w:type="spellEnd"/>
-      <w:r>
-        <w:rPr>
-          <w:rFonts w:ascii="Arial" w:eastAsia="Arial" w:hAnsi="Arial" w:cs="Arial"/>
-          <w:sz w:val="22"/>
-          <w:szCs w:val="22"/>
-          <w:lang w:val="en-US"/>
-        </w:rPr>
-        <w:t xml:space="preserve"> &gt;= 0). The route table has a UNIQUE constraint on (</w:t>
-      </w:r>
-      <w:proofErr w:type="spellStart"/>
-      <w:r>
-        <w:rPr>
-          <w:rFonts w:ascii="Arial" w:eastAsia="Arial" w:hAnsi="Arial" w:cs="Arial"/>
-          <w:sz w:val="22"/>
-          <w:szCs w:val="22"/>
-          <w:lang w:val="en-US"/>
-        </w:rPr>
-        <w:t>origin_airport</w:t>
-      </w:r>
-      <w:proofErr w:type="spellEnd"/>
-      <w:r>
-        <w:rPr>
-          <w:rFonts w:ascii="Arial" w:eastAsia="Arial" w:hAnsi="Arial" w:cs="Arial"/>
-          <w:sz w:val="22"/>
-          <w:szCs w:val="22"/>
-          <w:lang w:val="en-US"/>
-        </w:rPr>
-        <w:t xml:space="preserve">, </w:t>
-      </w:r>
-      <w:proofErr w:type="spellStart"/>
-      <w:r>
-        <w:rPr>
-          <w:rFonts w:ascii="Arial" w:eastAsia="Arial" w:hAnsi="Arial" w:cs="Arial"/>
-          <w:sz w:val="22"/>
-          <w:szCs w:val="22"/>
-          <w:lang w:val="en-US"/>
-        </w:rPr>
-        <w:t>destination_airport</w:t>
-      </w:r>
-      <w:proofErr w:type="spellEnd"/>
-      <w:r>
-        <w:rPr>
-          <w:rFonts w:ascii="Arial" w:eastAsia="Arial" w:hAnsi="Arial" w:cs="Arial"/>
-          <w:sz w:val="22"/>
-          <w:szCs w:val="22"/>
-          <w:lang w:val="en-US"/>
-        </w:rPr>
-        <w:t>). The flight table uses a composite primary key (</w:t>
-      </w:r>
-      <w:proofErr w:type="spellStart"/>
-      <w:r>
-        <w:rPr>
-          <w:rFonts w:ascii="Arial" w:eastAsia="Arial" w:hAnsi="Arial" w:cs="Arial"/>
-          <w:sz w:val="22"/>
-          <w:szCs w:val="22"/>
-          <w:lang w:val="en-US"/>
-        </w:rPr>
-        <w:t>flight_number</w:t>
-      </w:r>
-      <w:proofErr w:type="spellEnd"/>
-      <w:r>
-        <w:rPr>
-          <w:rFonts w:ascii="Arial" w:eastAsia="Arial" w:hAnsi="Arial" w:cs="Arial"/>
-          <w:sz w:val="22"/>
-          <w:szCs w:val="22"/>
-          <w:lang w:val="en-US"/>
-        </w:rPr>
-        <w:t xml:space="preserve">, </w:t>
-      </w:r>
-      <w:proofErr w:type="spellStart"/>
-      <w:r>
-        <w:rPr>
-          <w:rFonts w:ascii="Arial" w:eastAsia="Arial" w:hAnsi="Arial" w:cs="Arial"/>
-          <w:sz w:val="22"/>
-          <w:szCs w:val="22"/>
-          <w:lang w:val="en-US"/>
-        </w:rPr>
-        <w:t>scheduled_date</w:t>
-      </w:r>
-      <w:proofErr w:type="spellEnd"/>
-      <w:r>
-        <w:rPr>
-          <w:rFonts w:ascii="Arial" w:eastAsia="Arial" w:hAnsi="Arial" w:cs="Arial"/>
-          <w:sz w:val="22"/>
-          <w:szCs w:val="22"/>
-          <w:lang w:val="en-US"/>
-        </w:rPr>
-        <w:t>).</w:t>
-      </w:r>
-    </w:p>
-    <w:p>
-      <w:pPr>
-        <w:spacing w:after="120"/>
-        <w:rPr>
-          <w:rFonts w:ascii="Arial" w:eastAsia="Arial" w:hAnsi="Arial" w:cs="Arial"/>
-          <w:sz w:val="22"/>
-          <w:szCs w:val="22"/>
-        </w:rPr>
-      </w:pPr>
-    </w:p>
-    <w:p>
-      <w:pPr>
-        <w:spacing w:after="120"/>
-        <w:rPr>
-          <w:rFonts w:ascii="Arial" w:eastAsia="Arial" w:hAnsi="Arial" w:cs="Arial"/>
-          <w:sz w:val="22"/>
-          <w:szCs w:val="22"/>
-        </w:rPr>
-      </w:pPr>
-    </w:p>
-    <w:p>
-      <w:pPr>
-        <w:spacing w:after="120"/>
-      </w:pPr>
-    </w:p>
-    <w:p>
-      <w:pPr>
-        <w:spacing w:before="180" w:after="80"/>
-        <w:rPr>
-          <w:lang w:val="en-US"/>
-        </w:rPr>
-      </w:pPr>
-      <w:r>
-        <w:rPr>
-          <w:rFonts w:ascii="Arial" w:eastAsia="Arial" w:hAnsi="Arial" w:cs="Arial"/>
-          <w:b/>
-          <w:bCs/>
-          <w:sz w:val="24"/>
-          <w:szCs w:val="24"/>
-          <w:lang w:val="en-US"/>
-        </w:rPr>
-        <w:t>3.2 OLAP Tables (Snowflake DWH)</w:t>
-      </w:r>
-    </w:p>
-    <w:p>
-      <w:pPr>
-        <w:spacing w:after="120"/>
-        <w:rPr>
-          <w:lang w:val="en-US"/>
-        </w:rPr>
-      </w:pPr>
-      <w:proofErr w:type="spellStart"/>
-      <w:r>
-        <w:rPr>
-          <w:rFonts w:ascii="Arial" w:eastAsia="Arial" w:hAnsi="Arial" w:cs="Arial"/>
-          <w:sz w:val="22"/>
-          <w:szCs w:val="22"/>
-          <w:lang w:val="en-US"/>
-        </w:rPr>
-        <w:t>dim_country</w:t>
-      </w:r>
-      <w:proofErr w:type="spellEnd"/>
-      <w:r>
-        <w:rPr>
-          <w:rFonts w:ascii="Arial" w:eastAsia="Arial" w:hAnsi="Arial" w:cs="Arial"/>
-          <w:sz w:val="22"/>
-          <w:szCs w:val="22"/>
-          <w:lang w:val="en-US"/>
-        </w:rPr>
-        <w:t xml:space="preserve"> - Dimension - top of route/airline hierarchy</w:t>
-      </w:r>
-    </w:p>
-    <w:p>
-      <w:pPr>
-        <w:spacing w:after="120"/>
-        <w:rPr>
-          <w:lang w:val="en-US"/>
-        </w:rPr>
-      </w:pPr>
-      <w:proofErr w:type="spellStart"/>
-      <w:r>
-        <w:rPr>
-          <w:rFonts w:ascii="Arial" w:eastAsia="Arial" w:hAnsi="Arial" w:cs="Arial"/>
-          <w:sz w:val="22"/>
-          <w:szCs w:val="22"/>
-          <w:lang w:val="en-US"/>
-        </w:rPr>
-        <w:t>dim_city</w:t>
-      </w:r>
-      <w:proofErr w:type="spellEnd"/>
-      <w:r>
-        <w:rPr>
-          <w:rFonts w:ascii="Arial" w:eastAsia="Arial" w:hAnsi="Arial" w:cs="Arial"/>
-          <w:sz w:val="22"/>
-          <w:szCs w:val="22"/>
-          <w:lang w:val="en-US"/>
-        </w:rPr>
-        <w:t xml:space="preserve"> - Dimension - references </w:t>
-      </w:r>
-      <w:proofErr w:type="spellStart"/>
-      <w:r>
-        <w:rPr>
-          <w:rFonts w:ascii="Arial" w:eastAsia="Arial" w:hAnsi="Arial" w:cs="Arial"/>
-          <w:sz w:val="22"/>
-          <w:szCs w:val="22"/>
-          <w:lang w:val="en-US"/>
-        </w:rPr>
-        <w:t>dim_country</w:t>
-      </w:r>
-      <w:proofErr w:type="spellEnd"/>
-    </w:p>
-    <w:p>
-      <w:pPr>
-        <w:spacing w:after="120"/>
-        <w:rPr>
-          <w:lang w:val="en-US"/>
-        </w:rPr>
-      </w:pPr>
-      <w:proofErr w:type="spellStart"/>
-      <w:r>
-        <w:rPr>
-          <w:rFonts w:ascii="Arial" w:eastAsia="Arial" w:hAnsi="Arial" w:cs="Arial"/>
-          <w:sz w:val="22"/>
-          <w:szCs w:val="22"/>
-          <w:lang w:val="en-US"/>
-        </w:rPr>
-        <w:t>dim_airport</w:t>
-      </w:r>
-      <w:proofErr w:type="spellEnd"/>
-      <w:r>
-        <w:rPr>
-          <w:rFonts w:ascii="Arial" w:eastAsia="Arial" w:hAnsi="Arial" w:cs="Arial"/>
-          <w:sz w:val="22"/>
-          <w:szCs w:val="22"/>
-          <w:lang w:val="en-US"/>
-        </w:rPr>
-        <w:t xml:space="preserve"> - Dimension - references </w:t>
-      </w:r>
-      <w:proofErr w:type="spellStart"/>
-      <w:r>
-        <w:rPr>
-          <w:rFonts w:ascii="Arial" w:eastAsia="Arial" w:hAnsi="Arial" w:cs="Arial"/>
-          <w:sz w:val="22"/>
-          <w:szCs w:val="22"/>
-          <w:lang w:val="en-US"/>
-        </w:rPr>
-        <w:t>dim_city</w:t>
-      </w:r>
-      <w:proofErr w:type="spellEnd"/>
-    </w:p>
-    <w:p>
-      <w:pPr>
-        <w:spacing w:after="120"/>
-        <w:rPr>
-          <w:lang w:val="en-US"/>
-        </w:rPr>
-      </w:pPr>
-      <w:proofErr w:type="spellStart"/>
-      <w:r>
-        <w:rPr>
-          <w:rFonts w:ascii="Arial" w:eastAsia="Arial" w:hAnsi="Arial" w:cs="Arial"/>
-          <w:sz w:val="22"/>
-          <w:szCs w:val="22"/>
-          <w:lang w:val="en-US"/>
-        </w:rPr>
-        <w:t>dim_route</w:t>
-      </w:r>
-      <w:proofErr w:type="spellEnd"/>
-      <w:r>
-        <w:rPr>
-          <w:rFonts w:ascii="Arial" w:eastAsia="Arial" w:hAnsi="Arial" w:cs="Arial"/>
-          <w:sz w:val="22"/>
-          <w:szCs w:val="22"/>
-          <w:lang w:val="en-US"/>
-        </w:rPr>
-        <w:t xml:space="preserve"> - Dimension - references </w:t>
-      </w:r>
-      <w:proofErr w:type="spellStart"/>
-      <w:r>
-        <w:rPr>
-          <w:rFonts w:ascii="Arial" w:eastAsia="Arial" w:hAnsi="Arial" w:cs="Arial"/>
-          <w:sz w:val="22"/>
-          <w:szCs w:val="22"/>
-          <w:lang w:val="en-US"/>
-        </w:rPr>
-        <w:t>dim_airport</w:t>
-      </w:r>
-      <w:proofErr w:type="spellEnd"/>
-      <w:r>
-        <w:rPr>
-          <w:rFonts w:ascii="Arial" w:eastAsia="Arial" w:hAnsi="Arial" w:cs="Arial"/>
-          <w:sz w:val="22"/>
-          <w:szCs w:val="22"/>
-          <w:lang w:val="en-US"/>
-        </w:rPr>
-        <w:t xml:space="preserve"> for both origin and destination</w:t>
-      </w:r>
-    </w:p>
-    <w:p>
-      <w:pPr>
-        <w:spacing w:after="120"/>
-        <w:rPr>
-          <w:lang w:val="en-US"/>
-        </w:rPr>
-      </w:pPr>
-      <w:proofErr w:type="spellStart"/>
-      <w:r>
-        <w:rPr>
-          <w:rFonts w:ascii="Arial" w:eastAsia="Arial" w:hAnsi="Arial" w:cs="Arial"/>
-          <w:sz w:val="22"/>
-          <w:szCs w:val="22"/>
-          <w:lang w:val="en-US"/>
-        </w:rPr>
-        <w:t>dim_airline</w:t>
-      </w:r>
-      <w:proofErr w:type="spellEnd"/>
-      <w:r>
-        <w:rPr>
-          <w:rFonts w:ascii="Arial" w:eastAsia="Arial" w:hAnsi="Arial" w:cs="Arial"/>
-          <w:sz w:val="22"/>
-          <w:szCs w:val="22"/>
-          <w:lang w:val="en-US"/>
-        </w:rPr>
-        <w:t xml:space="preserve"> - Dimension - references </w:t>
-      </w:r>
-      <w:proofErr w:type="spellStart"/>
-      <w:r>
-        <w:rPr>
-          <w:rFonts w:ascii="Arial" w:eastAsia="Arial" w:hAnsi="Arial" w:cs="Arial"/>
-          <w:sz w:val="22"/>
-          <w:szCs w:val="22"/>
-          <w:lang w:val="en-US"/>
-        </w:rPr>
-        <w:t>dim_country</w:t>
-      </w:r>
-      <w:proofErr w:type="spellEnd"/>
-    </w:p>
-    <w:p>
-      <w:pPr>
-        <w:spacing w:after="120"/>
-        <w:rPr>
-          <w:lang w:val="en-US"/>
-        </w:rPr>
-      </w:pPr>
-      <w:proofErr w:type="spellStart"/>
-      <w:r>
-        <w:rPr>
-          <w:rFonts w:ascii="Arial" w:eastAsia="Arial" w:hAnsi="Arial" w:cs="Arial"/>
-          <w:sz w:val="22"/>
-          <w:szCs w:val="22"/>
-          <w:lang w:val="en-US"/>
-        </w:rPr>
-        <w:t>dim_aircraft</w:t>
-      </w:r>
-      <w:proofErr w:type="spellEnd"/>
-      <w:r>
-        <w:rPr>
-          <w:rFonts w:ascii="Arial" w:eastAsia="Arial" w:hAnsi="Arial" w:cs="Arial"/>
-          <w:sz w:val="22"/>
-          <w:szCs w:val="22"/>
-          <w:lang w:val="en-US"/>
-        </w:rPr>
-        <w:t xml:space="preserve"> - Dimension - aircraft details including seats per cabin class</w:t>
-      </w:r>
-    </w:p>
-    <w:p>
-      <w:pPr>
-        <w:spacing w:after="120"/>
-        <w:rPr>
-          <w:lang w:val="en-US"/>
-        </w:rPr>
-      </w:pPr>
-      <w:proofErr w:type="spellStart"/>
-      <w:r>
-        <w:rPr>
-          <w:rFonts w:ascii="Arial" w:eastAsia="Arial" w:hAnsi="Arial" w:cs="Arial"/>
-          <w:sz w:val="22"/>
-          <w:szCs w:val="22"/>
-          <w:lang w:val="en-US"/>
-        </w:rPr>
-        <w:t>dim_time</w:t>
-      </w:r>
-      <w:proofErr w:type="spellEnd"/>
-      <w:r>
-        <w:rPr>
-          <w:rFonts w:ascii="Arial" w:eastAsia="Arial" w:hAnsi="Arial" w:cs="Arial"/>
-          <w:sz w:val="22"/>
-          <w:szCs w:val="22"/>
-          <w:lang w:val="en-US"/>
-        </w:rPr>
-        <w:t xml:space="preserve"> - Dimension - date hierarchy (day, month, quarter, year)</w:t>
-      </w:r>
-    </w:p>
-    <w:p>
-      <w:pPr>
-        <w:spacing w:after="120"/>
-        <w:rPr>
-          <w:lang w:val="en-US"/>
-        </w:rPr>
-      </w:pPr>
-      <w:proofErr w:type="spellStart"/>
-      <w:r>
-        <w:rPr>
-          <w:rFonts w:ascii="Arial" w:eastAsia="Arial" w:hAnsi="Arial" w:cs="Arial"/>
-          <w:sz w:val="22"/>
-          <w:szCs w:val="22"/>
-          <w:lang w:val="en-US"/>
-        </w:rPr>
-        <w:t>dim_passenger</w:t>
-      </w:r>
-      <w:proofErr w:type="spellEnd"/>
-      <w:r>
-        <w:rPr>
-          <w:rFonts w:ascii="Arial" w:eastAsia="Arial" w:hAnsi="Arial" w:cs="Arial"/>
-          <w:sz w:val="22"/>
-          <w:szCs w:val="22"/>
-          <w:lang w:val="en-US"/>
-        </w:rPr>
-        <w:t xml:space="preserve"> - SCD Type 2 - passenger with change history (</w:t>
-      </w:r>
-      <w:proofErr w:type="spellStart"/>
-      <w:r>
-        <w:rPr>
-          <w:rFonts w:ascii="Arial" w:eastAsia="Arial" w:hAnsi="Arial" w:cs="Arial"/>
-          <w:sz w:val="22"/>
-          <w:szCs w:val="22"/>
-          <w:lang w:val="en-US"/>
-        </w:rPr>
-        <w:t>valid_from</w:t>
-      </w:r>
-      <w:proofErr w:type="spellEnd"/>
-      <w:r>
-        <w:rPr>
-          <w:rFonts w:ascii="Arial" w:eastAsia="Arial" w:hAnsi="Arial" w:cs="Arial"/>
-          <w:sz w:val="22"/>
-          <w:szCs w:val="22"/>
-          <w:lang w:val="en-US"/>
-        </w:rPr>
-        <w:t xml:space="preserve">, </w:t>
-      </w:r>
-      <w:proofErr w:type="spellStart"/>
-      <w:r>
-        <w:rPr>
-          <w:rFonts w:ascii="Arial" w:eastAsia="Arial" w:hAnsi="Arial" w:cs="Arial"/>
-          <w:sz w:val="22"/>
-          <w:szCs w:val="22"/>
-          <w:lang w:val="en-US"/>
-        </w:rPr>
-        <w:t>valid_to</w:t>
-      </w:r>
-      <w:proofErr w:type="spellEnd"/>
-      <w:r>
-        <w:rPr>
-          <w:rFonts w:ascii="Arial" w:eastAsia="Arial" w:hAnsi="Arial" w:cs="Arial"/>
-          <w:sz w:val="22"/>
-          <w:szCs w:val="22"/>
-          <w:lang w:val="en-US"/>
-        </w:rPr>
-        <w:t xml:space="preserve">, </w:t>
-      </w:r>
-      <w:proofErr w:type="spellStart"/>
-      <w:r>
-        <w:rPr>
-          <w:rFonts w:ascii="Arial" w:eastAsia="Arial" w:hAnsi="Arial" w:cs="Arial"/>
-          <w:sz w:val="22"/>
-          <w:szCs w:val="22"/>
-          <w:lang w:val="en-US"/>
-        </w:rPr>
-        <w:t>is_current</w:t>
-      </w:r>
-      <w:proofErr w:type="spellEnd"/>
-      <w:r>
-        <w:rPr>
-          <w:rFonts w:ascii="Arial" w:eastAsia="Arial" w:hAnsi="Arial" w:cs="Arial"/>
-          <w:sz w:val="22"/>
-          <w:szCs w:val="22"/>
-          <w:lang w:val="en-US"/>
-        </w:rPr>
-        <w:t>)</w:t>
-      </w:r>
-    </w:p>
-    <w:p>
-      <w:pPr>
-        <w:spacing w:after="120"/>
-        <w:rPr>
-          <w:lang w:val="en-US"/>
-        </w:rPr>
-      </w:pPr>
-      <w:proofErr w:type="spellStart"/>
-      <w:r>
-        <w:rPr>
-          <w:rFonts w:ascii="Arial" w:eastAsia="Arial" w:hAnsi="Arial" w:cs="Arial"/>
-          <w:sz w:val="22"/>
-          <w:szCs w:val="22"/>
-          <w:lang w:val="en-US"/>
-        </w:rPr>
-        <w:t>fact_ticket_sales</w:t>
-      </w:r>
-      <w:proofErr w:type="spellEnd"/>
-      <w:r>
-        <w:rPr>
-          <w:rFonts w:ascii="Arial" w:eastAsia="Arial" w:hAnsi="Arial" w:cs="Arial"/>
-          <w:sz w:val="22"/>
-          <w:szCs w:val="22"/>
-          <w:lang w:val="en-US"/>
-        </w:rPr>
-        <w:t xml:space="preserve"> - Fact - one row per ticket sold (price, baggage)</w:t>
-      </w:r>
-    </w:p>
-    <w:p>
-      <w:pPr>
-        <w:spacing w:after="120"/>
-        <w:rPr>
-          <w:lang w:val="en-US"/>
-        </w:rPr>
-      </w:pPr>
-      <w:proofErr w:type="spellStart"/>
-      <w:r>
-        <w:rPr>
-          <w:rFonts w:ascii="Arial" w:eastAsia="Arial" w:hAnsi="Arial" w:cs="Arial"/>
-          <w:sz w:val="22"/>
-          <w:szCs w:val="22"/>
-          <w:lang w:val="en-US"/>
-        </w:rPr>
-        <w:t>fact_flight_performance</w:t>
-      </w:r>
-      <w:proofErr w:type="spellEnd"/>
-      <w:r>
-        <w:rPr>
-          <w:rFonts w:ascii="Arial" w:eastAsia="Arial" w:hAnsi="Arial" w:cs="Arial"/>
-          <w:sz w:val="22"/>
-          <w:szCs w:val="22"/>
-          <w:lang w:val="en-US"/>
-        </w:rPr>
-        <w:t xml:space="preserve"> - Fact - one row per flight (delay, tickets sold, revenue)</w:t>
-      </w:r>
-    </w:p>
-    <w:p>
-      <w:pPr>
-        <w:spacing w:after="120"/>
-        <w:rPr>
-          <w:lang w:val="en-US"/>
-        </w:rPr>
-      </w:pPr>
-      <w:proofErr w:type="spellStart"/>
-      <w:r>
-        <w:rPr>
-          <w:rFonts w:ascii="Arial" w:eastAsia="Arial" w:hAnsi="Arial" w:cs="Arial"/>
-          <w:sz w:val="22"/>
-          <w:szCs w:val="22"/>
-          <w:lang w:val="en-US"/>
-        </w:rPr>
-        <w:t>bridge_booking_ticket</w:t>
-      </w:r>
-      <w:proofErr w:type="spellEnd"/>
-      <w:r>
-        <w:rPr>
-          <w:rFonts w:ascii="Arial" w:eastAsia="Arial" w:hAnsi="Arial" w:cs="Arial"/>
-          <w:sz w:val="22"/>
-          <w:szCs w:val="22"/>
-          <w:lang w:val="en-US"/>
-        </w:rPr>
-        <w:t xml:space="preserve"> - Bridge - links one booking to multiple tickets</w:t>
-      </w:r>
-    </w:p>
-    <w:p>
-      <w:pPr>
-        <w:spacing w:after="120"/>
-        <w:rPr>
-          <w:lang w:val="en-US"/>
-        </w:rPr>
-      </w:pPr>
-      <w:r>
-        <w:rPr>
-          <w:rFonts w:ascii="Arial" w:eastAsia="Arial" w:hAnsi="Arial" w:cs="Arial"/>
-          <w:sz w:val="22"/>
-          <w:szCs w:val="22"/>
-          <w:lang w:val="en-US"/>
-        </w:rPr>
-        <w:t xml:space="preserve">Snowflake normalization: dimensions form hierarchies via surrogate keys. For example, </w:t>
-      </w:r>
-      <w:proofErr w:type="spellStart"/>
-      <w:r>
-        <w:rPr>
-          <w:rFonts w:ascii="Arial" w:eastAsia="Arial" w:hAnsi="Arial" w:cs="Arial"/>
-          <w:sz w:val="22"/>
-          <w:szCs w:val="22"/>
-          <w:lang w:val="en-US"/>
-        </w:rPr>
-        <w:t>fact_ticket_sales</w:t>
-      </w:r>
-      <w:proofErr w:type="spellEnd"/>
-      <w:r>
-        <w:rPr>
-          <w:rFonts w:ascii="Arial" w:eastAsia="Arial" w:hAnsi="Arial" w:cs="Arial"/>
-          <w:sz w:val="22"/>
-          <w:szCs w:val="22"/>
-          <w:lang w:val="en-US"/>
-        </w:rPr>
-        <w:t xml:space="preserve"> references </w:t>
-      </w:r>
-      <w:proofErr w:type="spellStart"/>
-      <w:r>
-        <w:rPr>
-          <w:rFonts w:ascii="Arial" w:eastAsia="Arial" w:hAnsi="Arial" w:cs="Arial"/>
-          <w:sz w:val="22"/>
-          <w:szCs w:val="22"/>
-          <w:lang w:val="en-US"/>
-        </w:rPr>
-        <w:t>dim_route</w:t>
-      </w:r>
-      <w:proofErr w:type="spellEnd"/>
-      <w:r>
-        <w:rPr>
-          <w:rFonts w:ascii="Arial" w:eastAsia="Arial" w:hAnsi="Arial" w:cs="Arial"/>
-          <w:sz w:val="22"/>
-          <w:szCs w:val="22"/>
-          <w:lang w:val="en-US"/>
-        </w:rPr>
-        <w:t xml:space="preserve">, which references </w:t>
-      </w:r>
-      <w:proofErr w:type="spellStart"/>
-      <w:r>
-        <w:rPr>
-          <w:rFonts w:ascii="Arial" w:eastAsia="Arial" w:hAnsi="Arial" w:cs="Arial"/>
-          <w:sz w:val="22"/>
-          <w:szCs w:val="22"/>
-          <w:lang w:val="en-US"/>
-        </w:rPr>
-        <w:t>dim_airport</w:t>
-      </w:r>
-      <w:proofErr w:type="spellEnd"/>
-      <w:r>
-        <w:rPr>
-          <w:rFonts w:ascii="Arial" w:eastAsia="Arial" w:hAnsi="Arial" w:cs="Arial"/>
-          <w:sz w:val="22"/>
-          <w:szCs w:val="22"/>
-          <w:lang w:val="en-US"/>
-        </w:rPr>
-        <w:t xml:space="preserve">, which references </w:t>
-      </w:r>
-      <w:proofErr w:type="spellStart"/>
-      <w:r>
-        <w:rPr>
-          <w:rFonts w:ascii="Arial" w:eastAsia="Arial" w:hAnsi="Arial" w:cs="Arial"/>
-          <w:sz w:val="22"/>
-          <w:szCs w:val="22"/>
-          <w:lang w:val="en-US"/>
-        </w:rPr>
-        <w:t>dim_city</w:t>
-      </w:r>
-      <w:proofErr w:type="spellEnd"/>
-      <w:r>
-        <w:rPr>
-          <w:rFonts w:ascii="Arial" w:eastAsia="Arial" w:hAnsi="Arial" w:cs="Arial"/>
-          <w:sz w:val="22"/>
-          <w:szCs w:val="22"/>
-          <w:lang w:val="en-US"/>
-        </w:rPr>
-        <w:t xml:space="preserve">, which references </w:t>
-      </w:r>
-      <w:proofErr w:type="spellStart"/>
-      <w:r>
-        <w:rPr>
-          <w:rFonts w:ascii="Arial" w:eastAsia="Arial" w:hAnsi="Arial" w:cs="Arial"/>
-          <w:sz w:val="22"/>
-          <w:szCs w:val="22"/>
-          <w:lang w:val="en-US"/>
-        </w:rPr>
-        <w:t>dim_country</w:t>
-      </w:r>
-      <w:proofErr w:type="spellEnd"/>
-      <w:r>
-        <w:rPr>
-          <w:rFonts w:ascii="Arial" w:eastAsia="Arial" w:hAnsi="Arial" w:cs="Arial"/>
-          <w:sz w:val="22"/>
-          <w:szCs w:val="22"/>
-          <w:lang w:val="en-US"/>
-        </w:rPr>
-        <w:t>. The two fact tables store aggregations (</w:t>
-      </w:r>
-      <w:proofErr w:type="spellStart"/>
-      <w:r>
-        <w:rPr>
-          <w:rFonts w:ascii="Arial" w:eastAsia="Arial" w:hAnsi="Arial" w:cs="Arial"/>
-          <w:sz w:val="22"/>
-          <w:szCs w:val="22"/>
-          <w:lang w:val="en-US"/>
-        </w:rPr>
-        <w:t>tickets_sold</w:t>
-      </w:r>
-      <w:proofErr w:type="spellEnd"/>
-      <w:r>
-        <w:rPr>
-          <w:rFonts w:ascii="Arial" w:eastAsia="Arial" w:hAnsi="Arial" w:cs="Arial"/>
-          <w:sz w:val="22"/>
-          <w:szCs w:val="22"/>
-          <w:lang w:val="en-US"/>
-        </w:rPr>
-        <w:t xml:space="preserve">, </w:t>
-      </w:r>
-      <w:proofErr w:type="spellStart"/>
-      <w:r>
-        <w:rPr>
-          <w:rFonts w:ascii="Arial" w:eastAsia="Arial" w:hAnsi="Arial" w:cs="Arial"/>
-          <w:sz w:val="22"/>
-          <w:szCs w:val="22"/>
-          <w:lang w:val="en-US"/>
-        </w:rPr>
-        <w:t>total_revenue</w:t>
-      </w:r>
-      <w:proofErr w:type="spellEnd"/>
-      <w:r>
-        <w:rPr>
-          <w:rFonts w:ascii="Arial" w:eastAsia="Arial" w:hAnsi="Arial" w:cs="Arial"/>
-          <w:sz w:val="22"/>
-          <w:szCs w:val="22"/>
-          <w:lang w:val="en-US"/>
-        </w:rPr>
-        <w:t>) that do not exist in the OLTP database.</w:t>
-      </w:r>
-    </w:p>
-    <w:p>
-      <w:pPr>
-        <w:spacing w:before="240" w:after="120"/>
-        <w:rPr>
-          <w:lang w:val="en-US"/>
-        </w:rPr>
-      </w:pPr>
-      <w:r>
-        <w:rPr>
-          <w:rFonts w:ascii="Arial" w:eastAsia="Arial" w:hAnsi="Arial" w:cs="Arial"/>
-          <w:b/>
-          <w:bCs/>
-          <w:sz w:val="26"/>
-          <w:szCs w:val="26"/>
-          <w:lang w:val="en-US"/>
-        </w:rPr>
-        <w:lastRenderedPageBreak/>
-        <w:t>4. Instructions: Which Scripts to Run and How</w:t>
-      </w:r>
-    </w:p>
-    <w:p>
-      <w:pPr>
-        <w:spacing w:after="120"/>
-        <w:rPr>
-          <w:lang w:val="en-US"/>
-        </w:rPr>
-      </w:pPr>
-      <w:r>
-        <w:rPr>
-          <w:rFonts w:ascii="Arial" w:eastAsia="Arial" w:hAnsi="Arial" w:cs="Arial"/>
-          <w:sz w:val="22"/>
-          <w:szCs w:val="22"/>
-          <w:lang w:val="en-US"/>
-        </w:rPr>
-        <w:t xml:space="preserve">All scripts are executed in </w:t>
-      </w:r>
-      <w:proofErr w:type="spellStart"/>
-      <w:r>
-        <w:rPr>
-          <w:rFonts w:ascii="Arial" w:eastAsia="Arial" w:hAnsi="Arial" w:cs="Arial"/>
-          <w:sz w:val="22"/>
-          <w:szCs w:val="22"/>
-          <w:lang w:val="en-US"/>
-        </w:rPr>
-        <w:t>pgAdmin</w:t>
-      </w:r>
-      <w:proofErr w:type="spellEnd"/>
-      <w:r>
-        <w:rPr>
-          <w:rFonts w:ascii="Arial" w:eastAsia="Arial" w:hAnsi="Arial" w:cs="Arial"/>
-          <w:sz w:val="22"/>
-          <w:szCs w:val="22"/>
-          <w:lang w:val="en-US"/>
-        </w:rPr>
-        <w:t xml:space="preserve"> (Query Tool). The OLTP database is named </w:t>
-      </w:r>
-      <w:proofErr w:type="spellStart"/>
-      <w:r>
-        <w:rPr>
-          <w:rFonts w:ascii="Arial" w:eastAsia="Arial" w:hAnsi="Arial" w:cs="Arial"/>
-          <w:sz w:val="22"/>
-          <w:szCs w:val="22"/>
-          <w:lang w:val="en-US"/>
-        </w:rPr>
-        <w:t>postgres</w:t>
-      </w:r>
-      <w:proofErr w:type="spellEnd"/>
-      <w:r>
-        <w:rPr>
-          <w:rFonts w:ascii="Arial" w:eastAsia="Arial" w:hAnsi="Arial" w:cs="Arial"/>
-          <w:sz w:val="22"/>
-          <w:szCs w:val="22"/>
-          <w:lang w:val="en-US"/>
-        </w:rPr>
-        <w:t xml:space="preserve"> and the OLAP database is named </w:t>
-      </w:r>
-      <w:proofErr w:type="spellStart"/>
-      <w:r>
-        <w:rPr>
-          <w:rFonts w:ascii="Arial" w:eastAsia="Arial" w:hAnsi="Arial" w:cs="Arial"/>
-          <w:sz w:val="22"/>
-          <w:szCs w:val="22"/>
-          <w:lang w:val="en-US"/>
-        </w:rPr>
-        <w:t>olap</w:t>
-      </w:r>
-      <w:proofErr w:type="spellEnd"/>
-      <w:r>
-        <w:rPr>
-          <w:rFonts w:ascii="Arial" w:eastAsia="Arial" w:hAnsi="Arial" w:cs="Arial"/>
-          <w:sz w:val="22"/>
-          <w:szCs w:val="22"/>
-          <w:lang w:val="en-US"/>
-        </w:rPr>
-        <w:t>. The PostgreSQL server runs on localhost, port 1166.</w:t>
-      </w:r>
-    </w:p>
-    <w:p>
-      <w:pPr>
-        <w:spacing w:before="180" w:after="80"/>
-        <w:rPr>
-          <w:lang w:val="en-US"/>
-        </w:rPr>
-      </w:pPr>
-      <w:r>
-        <w:rPr>
-          <w:rFonts w:ascii="Arial" w:eastAsia="Arial" w:hAnsi="Arial" w:cs="Arial"/>
-          <w:b/>
-          <w:bCs/>
-          <w:sz w:val="24"/>
-          <w:szCs w:val="24"/>
+          <w:sz w:val="18"/>
+          <w:szCs w:val="18"/>
+          <w:lang w:val="en-US"/>
+        </w:rPr>
+      </w:pPr>
+      <w:r>
+        <w:rPr>
+          <w:rFonts w:ascii="Arial" w:eastAsia="Arial" w:hAnsi="Arial" w:cs="Arial"/>
+          <w:sz w:val="22"/>
+          <w:szCs w:val="22"/>
           <w:lang w:val="en-US"/>
         </w:rPr>
         <w:t>Step 1 - Create and populate OLTP</w:t>
@@ -1907,7 +2151,7 @@
           <w:szCs w:val="22"/>
           <w:lang w:val="en-US"/>
         </w:rPr>
-        <w:t xml:space="preserve"> to create all 10 OLTP tables. It drops existing tables first so it is rerunnable.</w:t>
+        <w:t xml:space="preserve"> to create all 12 OLTP tables. It drops existing tables first so it is rerunnable.</w:t>
       </w:r>
     </w:p>
     <w:p>
@@ -1956,16 +2200,16 @@
       <w:pPr>
         <w:spacing w:before="180" w:after="80"/>
         <w:rPr>
-          <w:lang w:val="en-US"/>
-        </w:rPr>
-      </w:pPr>
-      <w:r>
-        <w:rPr>
-          <w:rFonts w:ascii="Arial" w:eastAsia="Arial" w:hAnsi="Arial" w:cs="Arial"/>
-          <w:b/>
-          <w:bCs/>
-          <w:sz w:val="24"/>
-          <w:szCs w:val="24"/>
+          <w:sz w:val="18"/>
+          <w:szCs w:val="18"/>
+          <w:lang w:val="en-US"/>
+        </w:rPr>
+      </w:pPr>
+      <w:r>
+        <w:rPr>
+          <w:rFonts w:ascii="Arial" w:eastAsia="Arial" w:hAnsi="Arial" w:cs="Arial"/>
+          <w:sz w:val="22"/>
+          <w:szCs w:val="22"/>
           <w:lang w:val="en-US"/>
         </w:rPr>
         <w:t>Step 2 - Create OLAP and run ETL</w:t>
@@ -2436,14 +2680,16 @@
     <w:p>
       <w:pPr>
         <w:spacing w:before="180" w:after="80"/>
-      </w:pPr>
-      <w:r>
-        <w:rPr>
-          <w:rFonts w:ascii="Arial" w:eastAsia="Arial" w:hAnsi="Arial" w:cs="Arial"/>
-          <w:b/>
-          <w:bCs/>
-          <w:sz w:val="24"/>
-          <w:szCs w:val="24"/>
+        <w:rPr>
+          <w:sz w:val="18"/>
+          <w:szCs w:val="18"/>
+        </w:rPr>
+      </w:pPr>
+      <w:r>
+        <w:rPr>
+          <w:rFonts w:ascii="Arial" w:eastAsia="Arial" w:hAnsi="Arial" w:cs="Arial"/>
+          <w:sz w:val="22"/>
+          <w:szCs w:val="22"/>
         </w:rPr>
         <w:t xml:space="preserve">Step 3 - </w:t>
       </w:r>
@@ -2451,10 +2697,8 @@
       <w:r>
         <w:rPr>
           <w:rFonts w:ascii="Arial" w:eastAsia="Arial" w:hAnsi="Arial" w:cs="Arial"/>
-          <w:b/>
-          <w:bCs/>
-          <w:sz w:val="24"/>
-          <w:szCs w:val="24"/>
+          <w:sz w:val="22"/>
+          <w:szCs w:val="22"/>
         </w:rPr>
         <w:t>Queries</w:t>
       </w:r>
@@ -2462,10 +2706,8 @@
       <w:r>
         <w:rPr>
           <w:rFonts w:ascii="Arial" w:eastAsia="Arial" w:hAnsi="Arial" w:cs="Arial"/>
-          <w:b/>
-          <w:bCs/>
-          <w:sz w:val="24"/>
-          <w:szCs w:val="24"/>
+          <w:sz w:val="22"/>
+          <w:szCs w:val="22"/>
         </w:rPr>
         <w:t xml:space="preserve"> </w:t>
       </w:r>
@@ -2473,10 +2715,8 @@
       <w:r>
         <w:rPr>
           <w:rFonts w:ascii="Arial" w:eastAsia="Arial" w:hAnsi="Arial" w:cs="Arial"/>
-          <w:b/>
-          <w:bCs/>
-          <w:sz w:val="24"/>
-          <w:szCs w:val="24"/>
+          <w:sz w:val="22"/>
+          <w:szCs w:val="22"/>
         </w:rPr>
         <w:t>and</w:t>
       </w:r>
@@ -2484,10 +2724,8 @@
       <w:r>
         <w:rPr>
           <w:rFonts w:ascii="Arial" w:eastAsia="Arial" w:hAnsi="Arial" w:cs="Arial"/>
-          <w:b/>
-          <w:bCs/>
-          <w:sz w:val="24"/>
-          <w:szCs w:val="24"/>
+          <w:sz w:val="22"/>
+          <w:szCs w:val="22"/>
         </w:rPr>
         <w:t xml:space="preserve"> </w:t>
       </w:r>
@@ -2495,10 +2733,8 @@
       <w:r>
         <w:rPr>
           <w:rFonts w:ascii="Arial" w:eastAsia="Arial" w:hAnsi="Arial" w:cs="Arial"/>
-          <w:b/>
-          <w:bCs/>
-          <w:sz w:val="24"/>
-          <w:szCs w:val="24"/>
+          <w:sz w:val="22"/>
+          <w:szCs w:val="22"/>
         </w:rPr>
         <w:t>report</w:t>
       </w:r>
@@ -2686,148 +2922,13 @@
       <w:pPr>
         <w:spacing w:before="240" w:after="120"/>
         <w:rPr>
-          <w:lang w:val="en-US"/>
-        </w:rPr>
-      </w:pPr>
-      <w:r>
-        <w:rPr>
           <w:rFonts w:ascii="Arial" w:eastAsia="Arial" w:hAnsi="Arial" w:cs="Arial"/>
           <w:b/>
           <w:bCs/>
           <w:sz w:val="26"/>
           <w:szCs w:val="26"/>
-          <w:lang w:val="en-US"/>
-        </w:rPr>
-        <w:t>5. ETL Process Description</w:t>
-      </w:r>
-    </w:p>
-    <w:p>
-      <w:pPr>
-        <w:spacing w:after="120"/>
-        <w:rPr>
-          <w:lang w:val="en-US"/>
-        </w:rPr>
-      </w:pPr>
-      <w:r>
-        <w:rPr>
-          <w:rFonts w:ascii="Arial" w:eastAsia="Arial" w:hAnsi="Arial" w:cs="Arial"/>
-          <w:sz w:val="22"/>
-          <w:szCs w:val="22"/>
-          <w:lang w:val="en-US"/>
-        </w:rPr>
-        <w:t xml:space="preserve">The ETL (Extract, Transform, Load) process moves data from the OLTP database into the OLAP warehouse. Because PostgreSQL cannot directly query across two databases, the </w:t>
-      </w:r>
-      <w:proofErr w:type="spellStart"/>
-      <w:r>
-        <w:rPr>
-          <w:rFonts w:ascii="Arial" w:eastAsia="Arial" w:hAnsi="Arial" w:cs="Arial"/>
-          <w:sz w:val="22"/>
-          <w:szCs w:val="22"/>
-          <w:lang w:val="en-US"/>
-        </w:rPr>
-        <w:t>postgres_fdw</w:t>
-      </w:r>
-      <w:proofErr w:type="spellEnd"/>
-      <w:r>
-        <w:rPr>
-          <w:rFonts w:ascii="Arial" w:eastAsia="Arial" w:hAnsi="Arial" w:cs="Arial"/>
-          <w:sz w:val="22"/>
-          <w:szCs w:val="22"/>
-          <w:lang w:val="en-US"/>
-        </w:rPr>
-        <w:t xml:space="preserve"> extension is used to expose the OLTP tables as foreign tables (ft_*) inside the OLAP database.</w:t>
-      </w:r>
-    </w:p>
-    <w:p>
-      <w:pPr>
-        <w:spacing w:after="120"/>
-        <w:rPr>
-          <w:lang w:val="en-US"/>
-        </w:rPr>
-      </w:pPr>
-      <w:r>
-        <w:rPr>
-          <w:rFonts w:ascii="Arial" w:eastAsia="Arial" w:hAnsi="Arial" w:cs="Arial"/>
-          <w:sz w:val="22"/>
-          <w:szCs w:val="22"/>
-          <w:lang w:val="en-US"/>
-        </w:rPr>
-        <w:t>Extract: data is read from the OLTP tables via the foreign tables.</w:t>
-      </w:r>
-    </w:p>
-    <w:p>
-      <w:pPr>
-        <w:spacing w:after="120"/>
-        <w:rPr>
-          <w:lang w:val="en-US"/>
-        </w:rPr>
-      </w:pPr>
-      <w:r>
-        <w:rPr>
-          <w:rFonts w:ascii="Arial" w:eastAsia="Arial" w:hAnsi="Arial" w:cs="Arial"/>
-          <w:sz w:val="22"/>
-          <w:szCs w:val="22"/>
-          <w:lang w:val="en-US"/>
-        </w:rPr>
-        <w:t>Transform: country codes are replaced with surrogate keys, the route hierarchy is built (airport -&gt; city -&gt; country), dates are decomposed into a time dimension, and aggregations are computed (tickets sold and total revenue per flight).</w:t>
-      </w:r>
-    </w:p>
-    <w:p>
-      <w:pPr>
-        <w:spacing w:after="120"/>
-        <w:rPr>
-          <w:lang w:val="en-US"/>
-        </w:rPr>
-      </w:pPr>
-      <w:r>
-        <w:rPr>
-          <w:rFonts w:ascii="Arial" w:eastAsia="Arial" w:hAnsi="Arial" w:cs="Arial"/>
-          <w:sz w:val="22"/>
-          <w:szCs w:val="22"/>
-          <w:lang w:val="en-US"/>
-        </w:rPr>
-        <w:t xml:space="preserve">Load: dimensions are loaded first in dependency order (country, city, airport, route, airline, aircraft, time, passenger), then the fact tables and the bridge table. Every insert uses ON CONFLICT DO NOTHING or NOT EXISTS checks so previously loaded records are never modified or duplicated. The </w:t>
-      </w:r>
-      <w:proofErr w:type="spellStart"/>
-      <w:r>
-        <w:rPr>
-          <w:rFonts w:ascii="Arial" w:eastAsia="Arial" w:hAnsi="Arial" w:cs="Arial"/>
-          <w:sz w:val="22"/>
-          <w:szCs w:val="22"/>
-          <w:lang w:val="en-US"/>
-        </w:rPr>
-        <w:t>dim_passenger</w:t>
-      </w:r>
-      <w:proofErr w:type="spellEnd"/>
-      <w:r>
-        <w:rPr>
-          <w:rFonts w:ascii="Arial" w:eastAsia="Arial" w:hAnsi="Arial" w:cs="Arial"/>
-          <w:sz w:val="22"/>
-          <w:szCs w:val="22"/>
-          <w:lang w:val="en-US"/>
-        </w:rPr>
-        <w:t xml:space="preserve"> dimension implements SCD Type 2: a new row is inserted only when </w:t>
-      </w:r>
-      <w:proofErr w:type="gramStart"/>
-      <w:r>
-        <w:rPr>
-          <w:rFonts w:ascii="Arial" w:eastAsia="Arial" w:hAnsi="Arial" w:cs="Arial"/>
-          <w:sz w:val="22"/>
-          <w:szCs w:val="22"/>
-          <w:lang w:val="en-US"/>
-        </w:rPr>
-        <w:t>a passenger attributes</w:t>
-      </w:r>
-      <w:proofErr w:type="gramEnd"/>
-      <w:r>
-        <w:rPr>
-          <w:rFonts w:ascii="Arial" w:eastAsia="Arial" w:hAnsi="Arial" w:cs="Arial"/>
-          <w:sz w:val="22"/>
-          <w:szCs w:val="22"/>
-          <w:lang w:val="en-US"/>
-        </w:rPr>
-        <w:t xml:space="preserve"> change, preserving history.</w:t>
-      </w:r>
+        </w:rPr>
+      </w:pPr>
     </w:p>
     <w:p>
       <w:pPr>
@@ -2869,19 +2970,190 @@
       <w:pPr>
         <w:spacing w:before="240" w:after="120"/>
         <w:rPr>
-          <w:lang w:val="en-US"/>
-        </w:rPr>
-      </w:pPr>
-      <w:r>
-        <w:rPr>
           <w:rFonts w:ascii="Arial" w:eastAsia="Arial" w:hAnsi="Arial" w:cs="Arial"/>
           <w:b/>
           <w:bCs/>
           <w:sz w:val="26"/>
           <w:szCs w:val="26"/>
+        </w:rPr>
+      </w:pPr>
+    </w:p>
+    <w:p>
+      <w:pPr>
+        <w:spacing w:before="240" w:after="120"/>
+        <w:rPr>
+          <w:lang w:val="en-US"/>
+        </w:rPr>
+      </w:pPr>
+      <w:r>
+        <w:rPr>
+          <w:rFonts w:ascii="Arial" w:eastAsia="Arial" w:hAnsi="Arial" w:cs="Arial"/>
+          <w:b/>
+          <w:bCs/>
+          <w:sz w:val="26"/>
+          <w:szCs w:val="26"/>
           <w:lang w:val="en-US"/>
         </w:rPr>
         <w:lastRenderedPageBreak/>
+        <w:t>5. ETL Process Description</w:t>
+      </w:r>
+    </w:p>
+    <w:p>
+      <w:pPr>
+        <w:spacing w:after="120"/>
+        <w:rPr>
+          <w:lang w:val="en-US"/>
+        </w:rPr>
+      </w:pPr>
+      <w:r>
+        <w:rPr>
+          <w:rFonts w:ascii="Arial" w:eastAsia="Arial" w:hAnsi="Arial" w:cs="Arial"/>
+          <w:sz w:val="22"/>
+          <w:szCs w:val="22"/>
+          <w:lang w:val="en-US"/>
+        </w:rPr>
+        <w:t xml:space="preserve">The ETL (Extract, Transform, Load) process moves data from the OLTP database into the OLAP warehouse. Because PostgreSQL cannot directly query across two databases, the </w:t>
+      </w:r>
+      <w:proofErr w:type="spellStart"/>
+      <w:r>
+        <w:rPr>
+          <w:rFonts w:ascii="Arial" w:eastAsia="Arial" w:hAnsi="Arial" w:cs="Arial"/>
+          <w:sz w:val="22"/>
+          <w:szCs w:val="22"/>
+          <w:lang w:val="en-US"/>
+        </w:rPr>
+        <w:t>postgres_fdw</w:t>
+      </w:r>
+      <w:proofErr w:type="spellEnd"/>
+      <w:r>
+        <w:rPr>
+          <w:rFonts w:ascii="Arial" w:eastAsia="Arial" w:hAnsi="Arial" w:cs="Arial"/>
+          <w:sz w:val="22"/>
+          <w:szCs w:val="22"/>
+          <w:lang w:val="en-US"/>
+        </w:rPr>
+        <w:t xml:space="preserve"> extension is used to expose the OLTP tables as foreign tables (ft_*) inside the OLAP database.</w:t>
+      </w:r>
+    </w:p>
+    <w:p>
+      <w:pPr>
+        <w:spacing w:after="120"/>
+        <w:rPr>
+          <w:lang w:val="en-US"/>
+        </w:rPr>
+      </w:pPr>
+      <w:r>
+        <w:rPr>
+          <w:rFonts w:ascii="Arial" w:eastAsia="Arial" w:hAnsi="Arial" w:cs="Arial"/>
+          <w:sz w:val="22"/>
+          <w:szCs w:val="22"/>
+          <w:lang w:val="en-US"/>
+        </w:rPr>
+        <w:t>Extract: data is read from the OLTP tables via the foreign tables.</w:t>
+      </w:r>
+    </w:p>
+    <w:p>
+      <w:pPr>
+        <w:spacing w:after="120"/>
+        <w:rPr>
+          <w:lang w:val="en-US"/>
+        </w:rPr>
+      </w:pPr>
+      <w:r>
+        <w:rPr>
+          <w:rFonts w:ascii="Arial" w:eastAsia="Arial" w:hAnsi="Arial" w:cs="Arial"/>
+          <w:sz w:val="22"/>
+          <w:szCs w:val="22"/>
+          <w:lang w:val="en-US"/>
+        </w:rPr>
+        <w:t>Transform: country codes are replaced with surrogate keys, the route hierarchy is built (airport -&gt; city -&gt; country), dates are decomposed into a time dimension, and aggregations are computed (tickets sold and total revenue per flight).</w:t>
+      </w:r>
+    </w:p>
+    <w:p>
+      <w:pPr>
+        <w:spacing w:after="120"/>
+        <w:rPr>
+          <w:lang w:val="en-US"/>
+        </w:rPr>
+      </w:pPr>
+      <w:r>
+        <w:rPr>
+          <w:rFonts w:ascii="Arial" w:eastAsia="Arial" w:hAnsi="Arial" w:cs="Arial"/>
+          <w:sz w:val="22"/>
+          <w:szCs w:val="22"/>
+          <w:lang w:val="en-US"/>
+        </w:rPr>
+        <w:t xml:space="preserve">Load: dimensions are loaded first in dependency order (country, city, airport, route, airline, aircraft, time, passenger), then the fact tables and the bridge table. Every insert uses ON CONFLICT DO NOTHING or NOT EXISTS checks so previously loaded records are never modified or duplicated. The </w:t>
+      </w:r>
+      <w:proofErr w:type="spellStart"/>
+      <w:r>
+        <w:rPr>
+          <w:rFonts w:ascii="Arial" w:eastAsia="Arial" w:hAnsi="Arial" w:cs="Arial"/>
+          <w:sz w:val="22"/>
+          <w:szCs w:val="22"/>
+          <w:lang w:val="en-US"/>
+        </w:rPr>
+        <w:t>dim_passenger</w:t>
+      </w:r>
+      <w:proofErr w:type="spellEnd"/>
+      <w:r>
+        <w:rPr>
+          <w:rFonts w:ascii="Arial" w:eastAsia="Arial" w:hAnsi="Arial" w:cs="Arial"/>
+          <w:sz w:val="22"/>
+          <w:szCs w:val="22"/>
+          <w:lang w:val="en-US"/>
+        </w:rPr>
+        <w:t xml:space="preserve"> dimension implements SCD Type 2: a new row is inserted only when </w:t>
+      </w:r>
+      <w:proofErr w:type="gramStart"/>
+      <w:r>
+        <w:rPr>
+          <w:rFonts w:ascii="Arial" w:eastAsia="Arial" w:hAnsi="Arial" w:cs="Arial"/>
+          <w:sz w:val="22"/>
+          <w:szCs w:val="22"/>
+          <w:lang w:val="en-US"/>
+        </w:rPr>
+        <w:t>a passenger attributes</w:t>
+      </w:r>
+      <w:proofErr w:type="gramEnd"/>
+      <w:r>
+        <w:rPr>
+          <w:rFonts w:ascii="Arial" w:eastAsia="Arial" w:hAnsi="Arial" w:cs="Arial"/>
+          <w:sz w:val="22"/>
+          <w:szCs w:val="22"/>
+          <w:lang w:val="en-US"/>
+        </w:rPr>
+        <w:t xml:space="preserve"> change, preserving history.</w:t>
+      </w:r>
+    </w:p>
+    <w:p>
+      <w:pPr>
+        <w:spacing w:before="240" w:after="120"/>
+        <w:rPr>
+          <w:rFonts w:ascii="Arial" w:eastAsia="Arial" w:hAnsi="Arial" w:cs="Arial"/>
+          <w:b/>
+          <w:bCs/>
+          <w:sz w:val="26"/>
+          <w:szCs w:val="26"/>
+        </w:rPr>
+      </w:pPr>
+    </w:p>
+    <w:p>
+      <w:pPr>
+        <w:spacing w:before="240" w:after="120"/>
+        <w:rPr>
+          <w:lang w:val="en-US"/>
+        </w:rPr>
+      </w:pPr>
+      <w:r>
+        <w:rPr>
+          <w:rFonts w:ascii="Arial" w:eastAsia="Arial" w:hAnsi="Arial" w:cs="Arial"/>
+          <w:b/>
+          <w:bCs/>
+          <w:sz w:val="26"/>
+          <w:szCs w:val="26"/>
+          <w:lang w:val="en-US"/>
+        </w:rPr>
         <w:t>6. Power BI Report</w:t>
       </w:r>
     </w:p>
@@ -3137,6 +3409,13 @@
         </w:rPr>
         <w:t>The slicers allow the user to drill into performance for a specific airline or cabin class, and the visuals update interactively to answer the analytical questions defined for the OLAP database.</w:t>
       </w:r>
+    </w:p>
+    <w:p>
+      <w:pPr>
+        <w:rPr>
+          <w:lang w:val="en-US"/>
+        </w:rPr>
+      </w:pPr>
     </w:p>
     <w:sectPr>
       <w:pgSz w:w="12240" w:h="15840"/>

</xml_diff>